<commit_message>
Update formating to cv
</commit_message>
<xml_diff>
--- a/pio26.docx
+++ b/pio26.docx
@@ -4118,32 +4118,12 @@
     <w:p>
       <w:pPr>
         <w:pStyle w:val="Normal"/>
-        <w:rPr>
-          <w:rFonts w:ascii="Times New Roman" w:hAnsi="Times New Roman" w:eastAsia="Times New Roman" w:cs="Times New Roman"/>
-          <w:b w:val="0"/>
-          <w:bCs w:val="0"/>
-          <w:i w:val="0"/>
-          <w:iCs w:val="0"/>
-          <w:caps w:val="0"/>
-          <w:smallCaps w:val="0"/>
-          <w:noProof w:val="0"/>
-          <w:color w:val="auto" w:themeColor="background1" w:themeTint="FF" w:themeShade="FF"/>
-          <w:sz w:val="20"/>
-          <w:szCs w:val="20"/>
-          <w:lang w:val="en-US"/>
-        </w:rPr>
-      </w:pPr>
-      <w:r>
-        <w:rPr>
-          <w:rFonts w:ascii="Times New Roman" w:hAnsi="Times New Roman" w:eastAsia="Times New Roman" w:cs="Times New Roman"/>
-          <w:b w:val="0"/>
-          <w:bCs w:val="0"/>
-          <w:i w:val="0"/>
-          <w:iCs w:val="0"/>
-          <w:caps w:val="0"/>
-          <w:smallCaps w:val="0"/>
-          <w:noProof w:val="0"/>
-          <w:color w:val="auto"/>
+        <w:ind w:left="0"/>
+      </w:pPr>
+      <w:r>
+        <w:rPr>
+          <w:rFonts w:ascii="Times New Roman" w:hAnsi="Times New Roman" w:eastAsia="Times New Roman" w:cs="Times New Roman"/>
+          <w:noProof w:val="0"/>
           <w:sz w:val="20"/>
           <w:szCs w:val="20"/>
           <w:lang w:val="en-US"/>
@@ -4156,35 +4136,20 @@
         <w:pStyle w:val="ListParagraph"/>
         <w:numPr>
           <w:ilvl w:val="0"/>
-          <w:numId w:val="9"/>
+          <w:numId w:val="37"/>
         </w:numPr>
-        <w:spacing w:before="84"/>
-        <w:rPr>
-          <w:rFonts w:ascii="Times New Roman" w:hAnsi="Times New Roman" w:eastAsia="Times New Roman" w:cs="Times New Roman"/>
-          <w:b w:val="0"/>
-          <w:bCs w:val="0"/>
-          <w:i w:val="0"/>
-          <w:iCs w:val="0"/>
-          <w:caps w:val="0"/>
-          <w:smallCaps w:val="0"/>
-          <w:noProof w:val="0"/>
-          <w:color w:val="auto" w:themeColor="background1" w:themeTint="FF" w:themeShade="FF"/>
-          <w:sz w:val="20"/>
-          <w:szCs w:val="20"/>
-          <w:lang w:val="en-US"/>
-        </w:rPr>
-      </w:pPr>
-      <w:r>
-        <w:rPr>
-          <w:rFonts w:ascii="Times New Roman" w:hAnsi="Times New Roman" w:eastAsia="Times New Roman" w:cs="Times New Roman"/>
-          <w:b w:val="0"/>
-          <w:bCs w:val="0"/>
-          <w:i w:val="0"/>
-          <w:iCs w:val="0"/>
-          <w:caps w:val="0"/>
-          <w:smallCaps w:val="0"/>
-          <w:noProof w:val="0"/>
-          <w:color w:val="auto"/>
+        <w:rPr>
+          <w:rFonts w:ascii="Times New Roman" w:hAnsi="Times New Roman" w:eastAsia="Times New Roman" w:cs="Times New Roman"/>
+          <w:noProof w:val="0"/>
+          <w:sz w:val="20"/>
+          <w:szCs w:val="20"/>
+          <w:lang w:val="en-US"/>
+        </w:rPr>
+      </w:pPr>
+      <w:r>
+        <w:rPr>
+          <w:rFonts w:ascii="Times New Roman" w:hAnsi="Times New Roman" w:eastAsia="Times New Roman" w:cs="Times New Roman"/>
+          <w:noProof w:val="0"/>
           <w:sz w:val="20"/>
           <w:szCs w:val="20"/>
           <w:lang w:val="en-US"/>
@@ -4194,14 +4159,7 @@
       <w:r>
         <w:rPr>
           <w:rFonts w:ascii="Times New Roman" w:hAnsi="Times New Roman" w:eastAsia="Times New Roman" w:cs="Times New Roman"/>
-          <w:b w:val="0"/>
-          <w:bCs w:val="0"/>
-          <w:i w:val="0"/>
-          <w:iCs w:val="0"/>
-          <w:caps w:val="0"/>
-          <w:smallCaps w:val="0"/>
-          <w:noProof w:val="0"/>
-          <w:color w:val="auto"/>
+          <w:noProof w:val="0"/>
           <w:sz w:val="20"/>
           <w:szCs w:val="20"/>
           <w:lang w:val="en-US"/>
@@ -4211,14 +4169,7 @@
       <w:r>
         <w:rPr>
           <w:rFonts w:ascii="Times New Roman" w:hAnsi="Times New Roman" w:eastAsia="Times New Roman" w:cs="Times New Roman"/>
-          <w:b w:val="0"/>
-          <w:bCs w:val="0"/>
-          <w:i w:val="0"/>
-          <w:iCs w:val="0"/>
-          <w:caps w:val="0"/>
-          <w:smallCaps w:val="0"/>
-          <w:noProof w:val="0"/>
-          <w:color w:val="auto"/>
+          <w:noProof w:val="0"/>
           <w:sz w:val="20"/>
           <w:szCs w:val="20"/>
           <w:lang w:val="en-US"/>
@@ -4228,14 +4179,7 @@
       <w:r>
         <w:rPr>
           <w:rFonts w:ascii="Times New Roman" w:hAnsi="Times New Roman" w:eastAsia="Times New Roman" w:cs="Times New Roman"/>
-          <w:b w:val="0"/>
-          <w:bCs w:val="0"/>
-          <w:i w:val="0"/>
-          <w:iCs w:val="0"/>
-          <w:caps w:val="0"/>
-          <w:smallCaps w:val="0"/>
-          <w:noProof w:val="0"/>
-          <w:color w:val="auto"/>
+          <w:noProof w:val="0"/>
           <w:sz w:val="20"/>
           <w:szCs w:val="20"/>
           <w:lang w:val="en-US"/>
@@ -4245,14 +4189,7 @@
       <w:r>
         <w:rPr>
           <w:rFonts w:ascii="Times New Roman" w:hAnsi="Times New Roman" w:eastAsia="Times New Roman" w:cs="Times New Roman"/>
-          <w:b w:val="0"/>
-          <w:bCs w:val="0"/>
-          <w:i w:val="0"/>
-          <w:iCs w:val="0"/>
-          <w:caps w:val="0"/>
-          <w:smallCaps w:val="0"/>
-          <w:noProof w:val="0"/>
-          <w:color w:val="auto"/>
+          <w:noProof w:val="0"/>
           <w:sz w:val="20"/>
           <w:szCs w:val="20"/>
           <w:lang w:val="en-US"/>
@@ -4262,14 +4199,7 @@
       <w:r>
         <w:rPr>
           <w:rFonts w:ascii="Times New Roman" w:hAnsi="Times New Roman" w:eastAsia="Times New Roman" w:cs="Times New Roman"/>
-          <w:b w:val="0"/>
-          <w:bCs w:val="0"/>
-          <w:i w:val="0"/>
-          <w:iCs w:val="0"/>
-          <w:caps w:val="0"/>
-          <w:smallCaps w:val="0"/>
-          <w:noProof w:val="0"/>
-          <w:color w:val="auto"/>
+          <w:noProof w:val="0"/>
           <w:sz w:val="20"/>
           <w:szCs w:val="20"/>
           <w:lang w:val="en-US"/>
@@ -4282,40 +4212,105 @@
         <w:pStyle w:val="ListParagraph"/>
         <w:numPr>
           <w:ilvl w:val="0"/>
-          <w:numId w:val="9"/>
+          <w:numId w:val="37"/>
         </w:numPr>
-        <w:spacing w:before="84"/>
-        <w:rPr>
-          <w:rFonts w:ascii="Times New Roman" w:hAnsi="Times New Roman" w:eastAsia="Times New Roman" w:cs="Times New Roman"/>
-          <w:b w:val="0"/>
-          <w:bCs w:val="0"/>
-          <w:i w:val="0"/>
-          <w:iCs w:val="0"/>
-          <w:caps w:val="0"/>
-          <w:smallCaps w:val="0"/>
-          <w:noProof w:val="0"/>
-          <w:color w:val="auto" w:themeColor="background1" w:themeTint="FF" w:themeShade="FF"/>
-          <w:sz w:val="20"/>
-          <w:szCs w:val="20"/>
-          <w:lang w:val="en-US"/>
-        </w:rPr>
-      </w:pPr>
-      <w:r>
-        <w:rPr>
-          <w:rFonts w:ascii="Times New Roman" w:hAnsi="Times New Roman" w:eastAsia="Times New Roman" w:cs="Times New Roman"/>
-          <w:b w:val="0"/>
-          <w:bCs w:val="0"/>
-          <w:i w:val="0"/>
-          <w:iCs w:val="0"/>
-          <w:caps w:val="0"/>
-          <w:smallCaps w:val="0"/>
-          <w:noProof w:val="0"/>
-          <w:color w:val="auto"/>
-          <w:sz w:val="20"/>
-          <w:szCs w:val="20"/>
-          <w:lang w:val="en-US"/>
-        </w:rPr>
-        <w:t>Outside duties were to ensure the pitch and environs were in good condition – included</w:t>
+        <w:rPr>
+          <w:rFonts w:ascii="Times New Roman" w:hAnsi="Times New Roman" w:eastAsia="Times New Roman" w:cs="Times New Roman"/>
+          <w:noProof w:val="0"/>
+          <w:sz w:val="20"/>
+          <w:szCs w:val="20"/>
+          <w:lang w:val="en-US"/>
+        </w:rPr>
+      </w:pPr>
+      <w:r>
+        <w:rPr>
+          <w:rFonts w:ascii="Times New Roman" w:hAnsi="Times New Roman" w:eastAsia="Times New Roman" w:cs="Times New Roman"/>
+          <w:noProof w:val="0"/>
+          <w:sz w:val="20"/>
+          <w:szCs w:val="20"/>
+          <w:lang w:val="en-US"/>
+        </w:rPr>
+        <w:t xml:space="preserve">Outside duties were to ensure the pitch and environs were in good condition – </w:t>
+      </w:r>
+      <w:r>
+        <w:rPr>
+          <w:rFonts w:ascii="Times New Roman" w:hAnsi="Times New Roman" w:eastAsia="Times New Roman" w:cs="Times New Roman"/>
+          <w:noProof w:val="0"/>
+          <w:sz w:val="20"/>
+          <w:szCs w:val="20"/>
+          <w:lang w:val="en-US"/>
+        </w:rPr>
+        <w:t>including</w:t>
+      </w:r>
+      <w:r>
+        <w:rPr>
+          <w:rFonts w:ascii="Times New Roman" w:hAnsi="Times New Roman" w:eastAsia="Times New Roman" w:cs="Times New Roman"/>
+          <w:noProof w:val="0"/>
+          <w:sz w:val="20"/>
+          <w:szCs w:val="20"/>
+          <w:lang w:val="en-US"/>
+        </w:rPr>
+        <w:t xml:space="preserve"> </w:t>
+      </w:r>
+      <w:r>
+        <w:rPr>
+          <w:rFonts w:ascii="Times New Roman" w:hAnsi="Times New Roman" w:eastAsia="Times New Roman" w:cs="Times New Roman"/>
+          <w:noProof w:val="0"/>
+          <w:sz w:val="20"/>
+          <w:szCs w:val="20"/>
+          <w:lang w:val="en-US"/>
+        </w:rPr>
+        <w:t xml:space="preserve">power washing, weeding, </w:t>
+      </w:r>
+      <w:r>
+        <w:rPr>
+          <w:rFonts w:ascii="Times New Roman" w:hAnsi="Times New Roman" w:eastAsia="Times New Roman" w:cs="Times New Roman"/>
+          <w:noProof w:val="0"/>
+          <w:sz w:val="20"/>
+          <w:szCs w:val="20"/>
+          <w:lang w:val="en-US"/>
+        </w:rPr>
+        <w:t>strimming</w:t>
+      </w:r>
+      <w:r>
+        <w:rPr>
+          <w:rFonts w:ascii="Times New Roman" w:hAnsi="Times New Roman" w:eastAsia="Times New Roman" w:cs="Times New Roman"/>
+          <w:noProof w:val="0"/>
+          <w:sz w:val="20"/>
+          <w:szCs w:val="20"/>
+          <w:lang w:val="en-US"/>
+        </w:rPr>
+        <w:t>, hedging,</w:t>
+      </w:r>
+      <w:r>
+        <w:rPr>
+          <w:rFonts w:ascii="Times New Roman" w:hAnsi="Times New Roman" w:eastAsia="Times New Roman" w:cs="Times New Roman"/>
+          <w:noProof w:val="0"/>
+          <w:sz w:val="20"/>
+          <w:szCs w:val="20"/>
+          <w:lang w:val="en-US"/>
+        </w:rPr>
+        <w:t xml:space="preserve"> </w:t>
+      </w:r>
+      <w:r>
+        <w:rPr>
+          <w:rFonts w:ascii="Times New Roman" w:hAnsi="Times New Roman" w:eastAsia="Times New Roman" w:cs="Times New Roman"/>
+          <w:noProof w:val="0"/>
+          <w:sz w:val="20"/>
+          <w:szCs w:val="20"/>
+          <w:lang w:val="en-US"/>
+        </w:rPr>
+        <w:t xml:space="preserve">pitch cutting, painting, lining the pitch, setting up pitch for </w:t>
+      </w:r>
+      <w:r>
+        <w:rPr>
+          <w:rFonts w:ascii="Times New Roman" w:hAnsi="Times New Roman" w:eastAsia="Times New Roman" w:cs="Times New Roman"/>
+          <w:noProof w:val="0"/>
+          <w:sz w:val="20"/>
+          <w:szCs w:val="20"/>
+          <w:lang w:val="en-US"/>
+        </w:rPr>
+        <w:t xml:space="preserve">matches. </w:t>
       </w:r>
     </w:p>
     <w:p>
@@ -4323,137 +4318,37 @@
         <w:pStyle w:val="ListParagraph"/>
         <w:numPr>
           <w:ilvl w:val="0"/>
-          <w:numId w:val="9"/>
+          <w:numId w:val="37"/>
         </w:numPr>
-        <w:spacing w:before="84"/>
-        <w:rPr>
-          <w:rFonts w:ascii="Times New Roman" w:hAnsi="Times New Roman" w:eastAsia="Times New Roman" w:cs="Times New Roman"/>
-          <w:b w:val="0"/>
-          <w:bCs w:val="0"/>
-          <w:i w:val="0"/>
-          <w:iCs w:val="0"/>
-          <w:caps w:val="0"/>
-          <w:smallCaps w:val="0"/>
-          <w:noProof w:val="0"/>
-          <w:color w:val="auto" w:themeColor="background1" w:themeTint="FF" w:themeShade="FF"/>
-          <w:sz w:val="20"/>
-          <w:szCs w:val="20"/>
-          <w:lang w:val="en-US"/>
-        </w:rPr>
-      </w:pPr>
-      <w:r>
-        <w:rPr>
-          <w:rFonts w:ascii="Times New Roman" w:hAnsi="Times New Roman" w:eastAsia="Times New Roman" w:cs="Times New Roman"/>
-          <w:b w:val="0"/>
-          <w:bCs w:val="0"/>
-          <w:i w:val="0"/>
-          <w:iCs w:val="0"/>
-          <w:caps w:val="0"/>
-          <w:smallCaps w:val="0"/>
-          <w:noProof w:val="0"/>
-          <w:color w:val="auto"/>
-          <w:sz w:val="20"/>
-          <w:szCs w:val="20"/>
-          <w:lang w:val="en-US"/>
-        </w:rPr>
-        <w:t xml:space="preserve">power washing, weeding, </w:t>
-      </w:r>
-      <w:r>
-        <w:rPr>
-          <w:rFonts w:ascii="Times New Roman" w:hAnsi="Times New Roman" w:eastAsia="Times New Roman" w:cs="Times New Roman"/>
-          <w:b w:val="0"/>
-          <w:bCs w:val="0"/>
-          <w:i w:val="0"/>
-          <w:iCs w:val="0"/>
-          <w:caps w:val="0"/>
-          <w:smallCaps w:val="0"/>
-          <w:noProof w:val="0"/>
-          <w:color w:val="auto"/>
-          <w:sz w:val="20"/>
-          <w:szCs w:val="20"/>
-          <w:lang w:val="en-US"/>
-        </w:rPr>
-        <w:t>strimming</w:t>
-      </w:r>
-      <w:r>
-        <w:rPr>
-          <w:rFonts w:ascii="Times New Roman" w:hAnsi="Times New Roman" w:eastAsia="Times New Roman" w:cs="Times New Roman"/>
-          <w:b w:val="0"/>
-          <w:bCs w:val="0"/>
-          <w:i w:val="0"/>
-          <w:iCs w:val="0"/>
-          <w:caps w:val="0"/>
-          <w:smallCaps w:val="0"/>
-          <w:noProof w:val="0"/>
-          <w:color w:val="auto"/>
-          <w:sz w:val="20"/>
-          <w:szCs w:val="20"/>
-          <w:lang w:val="en-US"/>
-        </w:rPr>
-        <w:t>, hedging,</w:t>
-      </w:r>
-      <w:r>
-        <w:rPr>
-          <w:rFonts w:ascii="Times New Roman" w:hAnsi="Times New Roman" w:eastAsia="Times New Roman" w:cs="Times New Roman"/>
-          <w:b w:val="0"/>
-          <w:bCs w:val="0"/>
-          <w:i w:val="0"/>
-          <w:iCs w:val="0"/>
-          <w:caps w:val="0"/>
-          <w:smallCaps w:val="0"/>
-          <w:noProof w:val="0"/>
-          <w:color w:val="auto"/>
-          <w:sz w:val="20"/>
-          <w:szCs w:val="20"/>
-          <w:lang w:val="en-US"/>
-        </w:rPr>
-        <w:t xml:space="preserve"> </w:t>
-      </w:r>
-      <w:r>
-        <w:rPr>
-          <w:rFonts w:ascii="Times New Roman" w:hAnsi="Times New Roman" w:eastAsia="Times New Roman" w:cs="Times New Roman"/>
-          <w:b w:val="0"/>
-          <w:bCs w:val="0"/>
-          <w:i w:val="0"/>
-          <w:iCs w:val="0"/>
-          <w:caps w:val="0"/>
-          <w:smallCaps w:val="0"/>
-          <w:noProof w:val="0"/>
-          <w:color w:val="auto"/>
-          <w:sz w:val="20"/>
-          <w:szCs w:val="20"/>
-          <w:lang w:val="en-US"/>
-        </w:rPr>
-        <w:t xml:space="preserve">pitch cutting, painting, lining the pitch, setting up pitch for </w:t>
-      </w:r>
-      <w:r>
-        <w:rPr>
-          <w:rFonts w:ascii="Times New Roman" w:hAnsi="Times New Roman" w:eastAsia="Times New Roman" w:cs="Times New Roman"/>
-          <w:b w:val="0"/>
-          <w:bCs w:val="0"/>
-          <w:i w:val="0"/>
-          <w:iCs w:val="0"/>
-          <w:caps w:val="0"/>
-          <w:smallCaps w:val="0"/>
-          <w:noProof w:val="0"/>
-          <w:color w:val="auto"/>
-          <w:sz w:val="20"/>
-          <w:szCs w:val="20"/>
-          <w:lang w:val="en-US"/>
-        </w:rPr>
-        <w:t>matches. Inside</w:t>
-      </w:r>
-      <w:r>
-        <w:rPr>
-          <w:rFonts w:ascii="Times New Roman" w:hAnsi="Times New Roman" w:eastAsia="Times New Roman" w:cs="Times New Roman"/>
-          <w:b w:val="0"/>
-          <w:bCs w:val="0"/>
-          <w:i w:val="0"/>
-          <w:iCs w:val="0"/>
-          <w:caps w:val="0"/>
-          <w:smallCaps w:val="0"/>
-          <w:noProof w:val="0"/>
-          <w:color w:val="auto"/>
+        <w:rPr>
+          <w:rFonts w:ascii="Times New Roman" w:hAnsi="Times New Roman" w:eastAsia="Times New Roman" w:cs="Times New Roman"/>
+          <w:b w:val="0"/>
+          <w:bCs w:val="0"/>
+          <w:i w:val="0"/>
+          <w:iCs w:val="0"/>
+          <w:caps w:val="0"/>
+          <w:smallCaps w:val="0"/>
+          <w:noProof w:val="0"/>
+          <w:color w:val="FFFFFF" w:themeColor="background1" w:themeTint="FF" w:themeShade="FF"/>
+          <w:sz w:val="20"/>
+          <w:szCs w:val="20"/>
+          <w:lang w:val="en-US"/>
+        </w:rPr>
+      </w:pPr>
+      <w:r>
+        <w:rPr>
+          <w:rFonts w:ascii="Times New Roman" w:hAnsi="Times New Roman" w:eastAsia="Times New Roman" w:cs="Times New Roman"/>
+          <w:noProof w:val="0"/>
+          <w:sz w:val="20"/>
+          <w:szCs w:val="20"/>
+          <w:lang w:val="en-US"/>
+        </w:rPr>
+        <w:t>Inside</w:t>
+      </w:r>
+      <w:r>
+        <w:rPr>
+          <w:rFonts w:ascii="Times New Roman" w:hAnsi="Times New Roman" w:eastAsia="Times New Roman" w:cs="Times New Roman"/>
+          <w:noProof w:val="0"/>
           <w:sz w:val="20"/>
           <w:szCs w:val="20"/>
           <w:lang w:val="en-US"/>
@@ -4463,18 +4358,12 @@
     </w:p>
     <w:p>
       <w:pPr>
-        <w:rPr>
-          <w:rFonts w:ascii="Times New Roman" w:hAnsi="Times New Roman" w:eastAsia="Times New Roman" w:cs="Times New Roman"/>
-          <w:b w:val="1"/>
-          <w:bCs w:val="1"/>
-          <w:i w:val="0"/>
-          <w:iCs w:val="0"/>
-          <w:caps w:val="0"/>
-          <w:smallCaps w:val="0"/>
-          <w:noProof w:val="0"/>
-          <w:color w:val="auto" w:themeColor="background1" w:themeTint="FF" w:themeShade="FF"/>
-          <w:sz w:val="22"/>
-          <w:szCs w:val="22"/>
+        <w:pStyle w:val="ListParagraph"/>
+        <w:rPr>
+          <w:rFonts w:ascii="Times New Roman" w:hAnsi="Times New Roman" w:eastAsia="Times New Roman" w:cs="Times New Roman"/>
+          <w:noProof w:val="0"/>
+          <w:sz w:val="20"/>
+          <w:szCs w:val="20"/>
           <w:lang w:val="en-US"/>
         </w:rPr>
       </w:pPr>
@@ -4807,20 +4696,8 @@
     <w:p>
       <w:pPr>
         <w:pStyle w:val="Normal"/>
-        <w:rPr>
-          <w:rFonts w:ascii="Times New Roman" w:hAnsi="Times New Roman" w:eastAsia="Times New Roman" w:cs="Times New Roman"/>
-          <w:b w:val="1"/>
-          <w:bCs w:val="1"/>
-          <w:i w:val="0"/>
-          <w:iCs w:val="0"/>
-          <w:caps w:val="0"/>
-          <w:smallCaps w:val="0"/>
-          <w:noProof w:val="0"/>
-          <w:color w:val="000000" w:themeColor="text1" w:themeTint="FF" w:themeShade="FF"/>
-          <w:sz w:val="20"/>
-          <w:szCs w:val="20"/>
-          <w:lang w:val="en-US"/>
-        </w:rPr>
+        <w:widowControl w:val="1"/>
+        <w:spacing w:before="33"/>
       </w:pPr>
       <w:r>
         <w:rPr>
@@ -4869,47 +4746,6 @@
           <w:lang w:val="en-US"/>
         </w:rPr>
         <w:t>group)</w:t>
-      </w:r>
-    </w:p>
-    <w:p>
-      <w:pPr>
-        <w:pStyle w:val="ListParagraph"/>
-        <w:numPr>
-          <w:ilvl w:val="0"/>
-          <w:numId w:val="2"/>
-        </w:numPr>
-        <w:spacing w:before="33"/>
-        <w:rPr>
-          <w:rFonts w:ascii="Times New Roman" w:hAnsi="Times New Roman" w:eastAsia="Times New Roman" w:cs="Times New Roman"/>
-          <w:b w:val="0"/>
-          <w:bCs w:val="0"/>
-          <w:i w:val="0"/>
-          <w:iCs w:val="0"/>
-          <w:caps w:val="0"/>
-          <w:smallCaps w:val="0"/>
-          <w:noProof w:val="0"/>
-          <w:color w:val="000000" w:themeColor="text1" w:themeTint="FF" w:themeShade="FF"/>
-          <w:sz w:val="20"/>
-          <w:szCs w:val="20"/>
-          <w:lang w:val="en-US"/>
-        </w:rPr>
-      </w:pPr>
-      <w:r>
-        <w:rPr>
-          <w:rFonts w:ascii="Times New Roman" w:hAnsi="Times New Roman" w:eastAsia="Times New Roman" w:cs="Times New Roman"/>
-          <w:b w:val="0"/>
-          <w:bCs w:val="0"/>
-          <w:i w:val="0"/>
-          <w:iCs w:val="0"/>
-          <w:caps w:val="0"/>
-          <w:smallCaps w:val="0"/>
-          <w:noProof w:val="0"/>
-          <w:color w:val="000000" w:themeColor="text1" w:themeTint="FF" w:themeShade="FF"/>
-          <w:sz w:val="20"/>
-          <w:szCs w:val="20"/>
-          <w:lang w:val="en-IE"/>
-        </w:rPr>
-        <w:t>Own and drive the Customer Experience throughout the lifecycle of the Service Request to resolution.</w:t>
       </w:r>
     </w:p>
     <w:p>
@@ -4918,7 +4754,7 @@
         <w:widowControl w:val="1"/>
         <w:numPr>
           <w:ilvl w:val="0"/>
-          <w:numId w:val="2"/>
+          <w:numId w:val="31"/>
         </w:numPr>
         <w:spacing w:before="33"/>
         <w:rPr>
@@ -4933,7 +4769,7 @@
           <w:color w:val="000000" w:themeColor="text1" w:themeTint="FF" w:themeShade="FF"/>
           <w:sz w:val="20"/>
           <w:szCs w:val="20"/>
-          <w:lang w:val="en-US"/>
+          <w:lang w:val="en-IE"/>
         </w:rPr>
       </w:pPr>
       <w:r>
@@ -4951,41 +4787,7 @@
           <w:szCs w:val="20"/>
           <w:lang w:val="en-IE"/>
         </w:rPr>
-        <w:t xml:space="preserve">Reproducing issues in-house and responding back </w:t>
-      </w:r>
-      <w:r>
-        <w:rPr>
-          <w:rFonts w:ascii="Times New Roman" w:hAnsi="Times New Roman" w:eastAsia="Times New Roman" w:cs="Times New Roman"/>
-          <w:b w:val="0"/>
-          <w:bCs w:val="0"/>
-          <w:i w:val="0"/>
-          <w:iCs w:val="0"/>
-          <w:caps w:val="0"/>
-          <w:smallCaps w:val="0"/>
-          <w:noProof w:val="0"/>
-          <w:color w:val="000000" w:themeColor="text1" w:themeTint="FF" w:themeShade="FF"/>
-          <w:sz w:val="20"/>
-          <w:szCs w:val="20"/>
-          <w:lang w:val="en-IE"/>
-        </w:rPr>
-        <w:t>in a timely manner</w:t>
-      </w:r>
-      <w:r>
-        <w:rPr>
-          <w:rFonts w:ascii="Times New Roman" w:hAnsi="Times New Roman" w:eastAsia="Times New Roman" w:cs="Times New Roman"/>
-          <w:b w:val="0"/>
-          <w:bCs w:val="0"/>
-          <w:i w:val="0"/>
-          <w:iCs w:val="0"/>
-          <w:caps w:val="0"/>
-          <w:smallCaps w:val="0"/>
-          <w:noProof w:val="0"/>
-          <w:color w:val="000000" w:themeColor="text1" w:themeTint="FF" w:themeShade="FF"/>
-          <w:sz w:val="20"/>
-          <w:szCs w:val="20"/>
-          <w:lang w:val="en-IE"/>
-        </w:rPr>
-        <w:t>.</w:t>
+        <w:t>Own and drive the Customer Experience throughout the lifecycle of the Service Request to resolution.</w:t>
       </w:r>
     </w:p>
     <w:p>
@@ -4994,7 +4796,7 @@
         <w:widowControl w:val="1"/>
         <w:numPr>
           <w:ilvl w:val="0"/>
-          <w:numId w:val="2"/>
+          <w:numId w:val="31"/>
         </w:numPr>
         <w:spacing w:before="33"/>
         <w:rPr>
@@ -5027,7 +4829,41 @@
           <w:szCs w:val="20"/>
           <w:lang w:val="en-IE"/>
         </w:rPr>
-        <w:t>Collaborate with senior engineers and engineers to resolve customer product issue</w:t>
+        <w:t xml:space="preserve">Reproducing issues in-house and responding back </w:t>
+      </w:r>
+      <w:r>
+        <w:rPr>
+          <w:rFonts w:ascii="Times New Roman" w:hAnsi="Times New Roman" w:eastAsia="Times New Roman" w:cs="Times New Roman"/>
+          <w:b w:val="0"/>
+          <w:bCs w:val="0"/>
+          <w:i w:val="0"/>
+          <w:iCs w:val="0"/>
+          <w:caps w:val="0"/>
+          <w:smallCaps w:val="0"/>
+          <w:noProof w:val="0"/>
+          <w:color w:val="000000" w:themeColor="text1" w:themeTint="FF" w:themeShade="FF"/>
+          <w:sz w:val="20"/>
+          <w:szCs w:val="20"/>
+          <w:lang w:val="en-IE"/>
+        </w:rPr>
+        <w:t>in a timely manner</w:t>
+      </w:r>
+      <w:r>
+        <w:rPr>
+          <w:rFonts w:ascii="Times New Roman" w:hAnsi="Times New Roman" w:eastAsia="Times New Roman" w:cs="Times New Roman"/>
+          <w:b w:val="0"/>
+          <w:bCs w:val="0"/>
+          <w:i w:val="0"/>
+          <w:iCs w:val="0"/>
+          <w:caps w:val="0"/>
+          <w:smallCaps w:val="0"/>
+          <w:noProof w:val="0"/>
+          <w:color w:val="000000" w:themeColor="text1" w:themeTint="FF" w:themeShade="FF"/>
+          <w:sz w:val="20"/>
+          <w:szCs w:val="20"/>
+          <w:lang w:val="en-IE"/>
+        </w:rPr>
+        <w:t>.</w:t>
       </w:r>
     </w:p>
     <w:p>
@@ -5036,7 +4872,7 @@
         <w:widowControl w:val="1"/>
         <w:numPr>
           <w:ilvl w:val="0"/>
-          <w:numId w:val="2"/>
+          <w:numId w:val="31"/>
         </w:numPr>
         <w:spacing w:before="33"/>
         <w:rPr>
@@ -5069,75 +4905,7 @@
           <w:szCs w:val="20"/>
           <w:lang w:val="en-IE"/>
         </w:rPr>
-        <w:t xml:space="preserve">Use internal technical </w:t>
-      </w:r>
-      <w:r>
-        <w:rPr>
-          <w:rFonts w:ascii="Times New Roman" w:hAnsi="Times New Roman" w:eastAsia="Times New Roman" w:cs="Times New Roman"/>
-          <w:b w:val="0"/>
-          <w:bCs w:val="0"/>
-          <w:i w:val="0"/>
-          <w:iCs w:val="0"/>
-          <w:caps w:val="0"/>
-          <w:smallCaps w:val="0"/>
-          <w:noProof w:val="0"/>
-          <w:color w:val="000000" w:themeColor="text1" w:themeTint="FF" w:themeShade="FF"/>
-          <w:sz w:val="20"/>
-          <w:szCs w:val="20"/>
-          <w:lang w:val="en-IE"/>
-        </w:rPr>
-        <w:t>expertise</w:t>
-      </w:r>
-      <w:r>
-        <w:rPr>
-          <w:rFonts w:ascii="Times New Roman" w:hAnsi="Times New Roman" w:eastAsia="Times New Roman" w:cs="Times New Roman"/>
-          <w:b w:val="0"/>
-          <w:bCs w:val="0"/>
-          <w:i w:val="0"/>
-          <w:iCs w:val="0"/>
-          <w:caps w:val="0"/>
-          <w:smallCaps w:val="0"/>
-          <w:noProof w:val="0"/>
-          <w:color w:val="000000" w:themeColor="text1" w:themeTint="FF" w:themeShade="FF"/>
-          <w:sz w:val="20"/>
-          <w:szCs w:val="20"/>
-          <w:lang w:val="en-IE"/>
-        </w:rPr>
-        <w:t xml:space="preserve">, including peers, mentors, knowledge base, community </w:t>
-      </w:r>
-      <w:r>
-        <w:rPr>
-          <w:rFonts w:ascii="Times New Roman" w:hAnsi="Times New Roman" w:eastAsia="Times New Roman" w:cs="Times New Roman"/>
-          <w:b w:val="0"/>
-          <w:bCs w:val="0"/>
-          <w:i w:val="0"/>
-          <w:iCs w:val="0"/>
-          <w:caps w:val="0"/>
-          <w:smallCaps w:val="0"/>
-          <w:noProof w:val="0"/>
-          <w:color w:val="000000" w:themeColor="text1" w:themeTint="FF" w:themeShade="FF"/>
-          <w:sz w:val="20"/>
-          <w:szCs w:val="20"/>
-          <w:lang w:val="en-IE"/>
-        </w:rPr>
-        <w:t>forums</w:t>
-      </w:r>
-      <w:r>
-        <w:rPr>
-          <w:rFonts w:ascii="Times New Roman" w:hAnsi="Times New Roman" w:eastAsia="Times New Roman" w:cs="Times New Roman"/>
-          <w:b w:val="0"/>
-          <w:bCs w:val="0"/>
-          <w:i w:val="0"/>
-          <w:iCs w:val="0"/>
-          <w:caps w:val="0"/>
-          <w:smallCaps w:val="0"/>
-          <w:noProof w:val="0"/>
-          <w:color w:val="000000" w:themeColor="text1" w:themeTint="FF" w:themeShade="FF"/>
-          <w:sz w:val="20"/>
-          <w:szCs w:val="20"/>
-          <w:lang w:val="en-IE"/>
-        </w:rPr>
-        <w:t xml:space="preserve"> and other internal tools, to provide the most effective solutions to customer issues.</w:t>
+        <w:t>Collaborate with senior engineers and engineers to resolve customer product issue</w:t>
       </w:r>
     </w:p>
     <w:p>
@@ -5146,7 +4914,117 @@
         <w:widowControl w:val="1"/>
         <w:numPr>
           <w:ilvl w:val="0"/>
-          <w:numId w:val="2"/>
+          <w:numId w:val="31"/>
+        </w:numPr>
+        <w:spacing w:before="33"/>
+        <w:rPr>
+          <w:rFonts w:ascii="Times New Roman" w:hAnsi="Times New Roman" w:eastAsia="Times New Roman" w:cs="Times New Roman"/>
+          <w:b w:val="0"/>
+          <w:bCs w:val="0"/>
+          <w:i w:val="0"/>
+          <w:iCs w:val="0"/>
+          <w:caps w:val="0"/>
+          <w:smallCaps w:val="0"/>
+          <w:noProof w:val="0"/>
+          <w:color w:val="000000" w:themeColor="text1" w:themeTint="FF" w:themeShade="FF"/>
+          <w:sz w:val="20"/>
+          <w:szCs w:val="20"/>
+          <w:lang w:val="en-IE"/>
+        </w:rPr>
+      </w:pPr>
+      <w:r>
+        <w:rPr>
+          <w:rFonts w:ascii="Times New Roman" w:hAnsi="Times New Roman" w:eastAsia="Times New Roman" w:cs="Times New Roman"/>
+          <w:b w:val="0"/>
+          <w:bCs w:val="0"/>
+          <w:i w:val="0"/>
+          <w:iCs w:val="0"/>
+          <w:caps w:val="0"/>
+          <w:smallCaps w:val="0"/>
+          <w:noProof w:val="0"/>
+          <w:color w:val="000000" w:themeColor="text1" w:themeTint="FF" w:themeShade="FF"/>
+          <w:sz w:val="20"/>
+          <w:szCs w:val="20"/>
+          <w:lang w:val="en-IE"/>
+        </w:rPr>
+        <w:t xml:space="preserve">Use internal technical </w:t>
+      </w:r>
+      <w:r>
+        <w:rPr>
+          <w:rFonts w:ascii="Times New Roman" w:hAnsi="Times New Roman" w:eastAsia="Times New Roman" w:cs="Times New Roman"/>
+          <w:b w:val="0"/>
+          <w:bCs w:val="0"/>
+          <w:i w:val="0"/>
+          <w:iCs w:val="0"/>
+          <w:caps w:val="0"/>
+          <w:smallCaps w:val="0"/>
+          <w:noProof w:val="0"/>
+          <w:color w:val="000000" w:themeColor="text1" w:themeTint="FF" w:themeShade="FF"/>
+          <w:sz w:val="20"/>
+          <w:szCs w:val="20"/>
+          <w:lang w:val="en-IE"/>
+        </w:rPr>
+        <w:t>expertise</w:t>
+      </w:r>
+      <w:r>
+        <w:rPr>
+          <w:rFonts w:ascii="Times New Roman" w:hAnsi="Times New Roman" w:eastAsia="Times New Roman" w:cs="Times New Roman"/>
+          <w:b w:val="0"/>
+          <w:bCs w:val="0"/>
+          <w:i w:val="0"/>
+          <w:iCs w:val="0"/>
+          <w:caps w:val="0"/>
+          <w:smallCaps w:val="0"/>
+          <w:noProof w:val="0"/>
+          <w:color w:val="000000" w:themeColor="text1" w:themeTint="FF" w:themeShade="FF"/>
+          <w:sz w:val="20"/>
+          <w:szCs w:val="20"/>
+          <w:lang w:val="en-IE"/>
+        </w:rPr>
+        <w:t xml:space="preserve">, including peers, mentors, knowledge base, community </w:t>
+      </w:r>
+      <w:r>
+        <w:rPr>
+          <w:rFonts w:ascii="Times New Roman" w:hAnsi="Times New Roman" w:eastAsia="Times New Roman" w:cs="Times New Roman"/>
+          <w:b w:val="0"/>
+          <w:bCs w:val="0"/>
+          <w:i w:val="0"/>
+          <w:iCs w:val="0"/>
+          <w:caps w:val="0"/>
+          <w:smallCaps w:val="0"/>
+          <w:noProof w:val="0"/>
+          <w:color w:val="000000" w:themeColor="text1" w:themeTint="FF" w:themeShade="FF"/>
+          <w:sz w:val="20"/>
+          <w:szCs w:val="20"/>
+          <w:lang w:val="en-IE"/>
+        </w:rPr>
+        <w:t>forums</w:t>
+      </w:r>
+      <w:r>
+        <w:rPr>
+          <w:rFonts w:ascii="Times New Roman" w:hAnsi="Times New Roman" w:eastAsia="Times New Roman" w:cs="Times New Roman"/>
+          <w:b w:val="0"/>
+          <w:bCs w:val="0"/>
+          <w:i w:val="0"/>
+          <w:iCs w:val="0"/>
+          <w:caps w:val="0"/>
+          <w:smallCaps w:val="0"/>
+          <w:noProof w:val="0"/>
+          <w:color w:val="000000" w:themeColor="text1" w:themeTint="FF" w:themeShade="FF"/>
+          <w:sz w:val="20"/>
+          <w:szCs w:val="20"/>
+          <w:lang w:val="en-IE"/>
+        </w:rPr>
+        <w:t xml:space="preserve"> and other internal tools, to provide the most effective solutions to customer issues.</w:t>
+      </w:r>
+    </w:p>
+    <w:p>
+      <w:pPr>
+        <w:pStyle w:val="ListParagraph"/>
+        <w:widowControl w:val="1"/>
+        <w:numPr>
+          <w:ilvl w:val="0"/>
+          <w:numId w:val="31"/>
         </w:numPr>
         <w:spacing w:before="33"/>
         <w:rPr>
@@ -5374,20 +5252,8 @@
       <w:pPr>
         <w:pStyle w:val="Normal"/>
         <w:widowControl w:val="1"/>
-        <w:rPr>
-          <w:rFonts w:ascii="Times New Roman" w:hAnsi="Times New Roman" w:eastAsia="Times New Roman" w:cs="Times New Roman"/>
-          <w:b w:val="0"/>
-          <w:bCs w:val="0"/>
-          <w:i w:val="0"/>
-          <w:iCs w:val="0"/>
-          <w:caps w:val="0"/>
-          <w:smallCaps w:val="0"/>
-          <w:noProof w:val="0"/>
-          <w:color w:val="auto"/>
-          <w:sz w:val="20"/>
-          <w:szCs w:val="20"/>
-          <w:lang w:val="en-US"/>
-        </w:rPr>
+        <w:spacing w:before="0" w:line="269" w:lineRule="exact"/>
+        <w:ind/>
       </w:pPr>
       <w:r>
         <w:rPr>
@@ -5399,6 +5265,221 @@
           <w:lang w:val="en-US"/>
         </w:rPr>
         <w:t>Office Administrator/General Operative</w:t>
+      </w:r>
+    </w:p>
+    <w:p>
+      <w:pPr>
+        <w:pStyle w:val="ListParagraph"/>
+        <w:widowControl w:val="1"/>
+        <w:numPr>
+          <w:ilvl w:val="0"/>
+          <w:numId w:val="30"/>
+        </w:numPr>
+        <w:spacing w:before="0" w:line="269" w:lineRule="exact"/>
+        <w:ind/>
+        <w:rPr>
+          <w:rFonts w:ascii="Times New Roman" w:hAnsi="Times New Roman" w:eastAsia="Times New Roman" w:cs="Times New Roman"/>
+          <w:b w:val="0"/>
+          <w:bCs w:val="0"/>
+          <w:i w:val="0"/>
+          <w:iCs w:val="0"/>
+          <w:caps w:val="0"/>
+          <w:smallCaps w:val="0"/>
+          <w:noProof w:val="0"/>
+          <w:color w:val="auto"/>
+          <w:sz w:val="20"/>
+          <w:szCs w:val="20"/>
+          <w:lang w:val="en-US"/>
+        </w:rPr>
+      </w:pPr>
+      <w:r>
+        <w:rPr>
+          <w:rFonts w:ascii="Times New Roman" w:hAnsi="Times New Roman" w:eastAsia="Times New Roman" w:cs="Times New Roman"/>
+          <w:b w:val="0"/>
+          <w:bCs w:val="0"/>
+          <w:i w:val="0"/>
+          <w:iCs w:val="0"/>
+          <w:caps w:val="0"/>
+          <w:smallCaps w:val="0"/>
+          <w:noProof w:val="0"/>
+          <w:color w:val="auto"/>
+          <w:sz w:val="20"/>
+          <w:szCs w:val="20"/>
+          <w:lang w:val="en-US"/>
+        </w:rPr>
+        <w:t>Completed timecards, created Scheduling database (MS Access), PC maintenance.</w:t>
+      </w:r>
+    </w:p>
+    <w:p>
+      <w:pPr>
+        <w:pStyle w:val="ListParagraph"/>
+        <w:widowControl w:val="1"/>
+        <w:numPr>
+          <w:ilvl w:val="0"/>
+          <w:numId w:val="30"/>
+        </w:numPr>
+        <w:spacing w:before="0" w:line="269" w:lineRule="exact"/>
+        <w:ind/>
+        <w:rPr>
+          <w:rFonts w:ascii="Times New Roman" w:hAnsi="Times New Roman" w:eastAsia="Times New Roman" w:cs="Times New Roman"/>
+          <w:b w:val="0"/>
+          <w:bCs w:val="0"/>
+          <w:i w:val="0"/>
+          <w:iCs w:val="0"/>
+          <w:caps w:val="0"/>
+          <w:smallCaps w:val="0"/>
+          <w:noProof w:val="0"/>
+          <w:color w:val="auto"/>
+          <w:sz w:val="20"/>
+          <w:szCs w:val="20"/>
+          <w:lang w:val="en-US"/>
+        </w:rPr>
+      </w:pPr>
+      <w:r>
+        <w:rPr>
+          <w:rFonts w:ascii="Times New Roman" w:hAnsi="Times New Roman" w:eastAsia="Times New Roman" w:cs="Times New Roman"/>
+          <w:b w:val="0"/>
+          <w:bCs w:val="0"/>
+          <w:i w:val="0"/>
+          <w:iCs w:val="0"/>
+          <w:caps w:val="0"/>
+          <w:smallCaps w:val="0"/>
+          <w:noProof w:val="0"/>
+          <w:color w:val="auto"/>
+          <w:sz w:val="20"/>
+          <w:szCs w:val="20"/>
+          <w:lang w:val="en-US"/>
+        </w:rPr>
+        <w:t xml:space="preserve">General Maintenance of Edel Quinn Hall and surrounding </w:t>
+      </w:r>
+      <w:r>
+        <w:rPr>
+          <w:rFonts w:ascii="Times New Roman" w:hAnsi="Times New Roman" w:eastAsia="Times New Roman" w:cs="Times New Roman"/>
+          <w:b w:val="0"/>
+          <w:bCs w:val="0"/>
+          <w:i w:val="0"/>
+          <w:iCs w:val="0"/>
+          <w:caps w:val="0"/>
+          <w:smallCaps w:val="0"/>
+          <w:noProof w:val="0"/>
+          <w:color w:val="auto"/>
+          <w:sz w:val="20"/>
+          <w:szCs w:val="20"/>
+          <w:lang w:val="en-US"/>
+        </w:rPr>
+        <w:t>areas</w:t>
+      </w:r>
+      <w:r>
+        <w:rPr>
+          <w:rFonts w:ascii="Times New Roman" w:hAnsi="Times New Roman" w:eastAsia="Times New Roman" w:cs="Times New Roman"/>
+          <w:b w:val="0"/>
+          <w:bCs w:val="0"/>
+          <w:i w:val="0"/>
+          <w:iCs w:val="0"/>
+          <w:caps w:val="0"/>
+          <w:smallCaps w:val="0"/>
+          <w:noProof w:val="0"/>
+          <w:color w:val="auto"/>
+          <w:sz w:val="20"/>
+          <w:szCs w:val="20"/>
+          <w:lang w:val="en-US"/>
+        </w:rPr>
+        <w:t>.</w:t>
+      </w:r>
+    </w:p>
+    <w:p>
+      <w:pPr>
+        <w:pStyle w:val="ListParagraph"/>
+        <w:widowControl w:val="1"/>
+        <w:numPr>
+          <w:ilvl w:val="0"/>
+          <w:numId w:val="30"/>
+        </w:numPr>
+        <w:spacing w:before="0" w:line="269" w:lineRule="exact"/>
+        <w:ind/>
+        <w:rPr>
+          <w:rFonts w:ascii="Times New Roman" w:hAnsi="Times New Roman" w:eastAsia="Times New Roman" w:cs="Times New Roman"/>
+          <w:b w:val="0"/>
+          <w:bCs w:val="0"/>
+          <w:i w:val="0"/>
+          <w:iCs w:val="0"/>
+          <w:caps w:val="0"/>
+          <w:smallCaps w:val="0"/>
+          <w:noProof w:val="0"/>
+          <w:color w:val="auto"/>
+          <w:sz w:val="20"/>
+          <w:szCs w:val="20"/>
+          <w:lang w:val="en-US"/>
+        </w:rPr>
+      </w:pPr>
+      <w:r>
+        <w:rPr>
+          <w:rFonts w:ascii="Times New Roman" w:hAnsi="Times New Roman" w:eastAsia="Times New Roman" w:cs="Times New Roman"/>
+          <w:b w:val="0"/>
+          <w:bCs w:val="0"/>
+          <w:i w:val="0"/>
+          <w:iCs w:val="0"/>
+          <w:caps w:val="0"/>
+          <w:smallCaps w:val="0"/>
+          <w:noProof w:val="0"/>
+          <w:color w:val="auto"/>
+          <w:sz w:val="20"/>
+          <w:szCs w:val="20"/>
+          <w:lang w:val="en-US"/>
+        </w:rPr>
+        <w:t>Event Management – weekly bingo, dramas, dances, functions etc.</w:t>
+      </w:r>
+    </w:p>
+    <w:p>
+      <w:pPr>
+        <w:pStyle w:val="ListParagraph"/>
+        <w:widowControl w:val="1"/>
+        <w:numPr>
+          <w:ilvl w:val="0"/>
+          <w:numId w:val="30"/>
+        </w:numPr>
+        <w:spacing w:before="0" w:line="269" w:lineRule="exact"/>
+        <w:ind/>
+        <w:rPr>
+          <w:rFonts w:ascii="Times New Roman" w:hAnsi="Times New Roman" w:eastAsia="Times New Roman" w:cs="Times New Roman"/>
+          <w:b w:val="0"/>
+          <w:bCs w:val="0"/>
+          <w:noProof w:val="0"/>
+          <w:color w:val="auto"/>
+          <w:sz w:val="20"/>
+          <w:szCs w:val="20"/>
+          <w:lang w:val="en-US"/>
+        </w:rPr>
+      </w:pPr>
+      <w:r>
+        <w:rPr>
+          <w:rFonts w:ascii="Times New Roman" w:hAnsi="Times New Roman" w:eastAsia="Times New Roman" w:cs="Times New Roman"/>
+          <w:b w:val="0"/>
+          <w:bCs w:val="0"/>
+          <w:noProof w:val="0"/>
+          <w:color w:val="auto"/>
+          <w:sz w:val="20"/>
+          <w:szCs w:val="20"/>
+          <w:lang w:val="en-US"/>
+        </w:rPr>
+        <w:t>Inventory control of shop and bar</w:t>
+      </w:r>
+    </w:p>
+    <w:p>
+      <w:pPr>
+        <w:pStyle w:val="Heading2"/>
+      </w:pPr>
+      <w:r>
+        <w:rPr>
+          <w:rFonts w:ascii="Times New Roman" w:hAnsi="Times New Roman" w:eastAsia="Times New Roman" w:cs="Times New Roman"/>
+          <w:b w:val="1"/>
+          <w:bCs w:val="1"/>
+          <w:noProof w:val="0"/>
+          <w:sz w:val="24"/>
+          <w:szCs w:val="24"/>
+          <w:lang w:val="en-US"/>
+        </w:rPr>
+        <w:t>I.D.C. Ltd, 2006 – 2009</w:t>
       </w:r>
     </w:p>
     <w:p>
@@ -5406,45 +5487,25 @@
         <w:pStyle w:val="ListParagraph"/>
         <w:numPr>
           <w:ilvl w:val="0"/>
-          <w:numId w:val="3"/>
+          <w:numId w:val="35"/>
         </w:numPr>
-        <w:tabs>
-          <w:tab w:val="left" w:leader="none" w:pos="1031"/>
-          <w:tab w:val="left" w:leader="none" w:pos="1032"/>
-        </w:tabs>
-        <w:spacing w:before="0" w:line="268" w:lineRule="exact"/>
-        <w:ind w:left="409" w:hanging="360"/>
-        <w:rPr>
-          <w:rFonts w:ascii="Times New Roman" w:hAnsi="Times New Roman" w:eastAsia="Times New Roman" w:cs="Times New Roman"/>
-          <w:b w:val="0"/>
-          <w:bCs w:val="0"/>
-          <w:i w:val="0"/>
-          <w:iCs w:val="0"/>
-          <w:caps w:val="0"/>
-          <w:smallCaps w:val="0"/>
-          <w:noProof w:val="0"/>
-          <w:color w:val="auto" w:themeColor="background1" w:themeTint="FF" w:themeShade="FF"/>
-          <w:sz w:val="20"/>
-          <w:szCs w:val="20"/>
-          <w:lang w:val="en-US"/>
-        </w:rPr>
-      </w:pPr>
-      <w:r>
-        <w:rPr>
-          <w:rFonts w:ascii="Times New Roman" w:hAnsi="Times New Roman" w:eastAsia="Times New Roman" w:cs="Times New Roman"/>
-          <w:b w:val="0"/>
-          <w:bCs w:val="0"/>
-          <w:i w:val="0"/>
-          <w:iCs w:val="0"/>
-          <w:caps w:val="0"/>
-          <w:smallCaps w:val="0"/>
-          <w:noProof w:val="0"/>
-          <w:color w:val="auto"/>
-          <w:sz w:val="20"/>
-          <w:szCs w:val="20"/>
-          <w:lang w:val="en-US"/>
-        </w:rPr>
-        <w:t>Completed timecards, created Scheduling database (MS Access), PC maintenance.</w:t>
+        <w:rPr>
+          <w:rFonts w:ascii="Times New Roman" w:hAnsi="Times New Roman" w:eastAsia="Times New Roman" w:cs="Times New Roman"/>
+          <w:noProof w:val="0"/>
+          <w:sz w:val="20"/>
+          <w:szCs w:val="20"/>
+          <w:lang w:val="en-US"/>
+        </w:rPr>
+      </w:pPr>
+      <w:r>
+        <w:rPr>
+          <w:rFonts w:ascii="Times New Roman" w:hAnsi="Times New Roman" w:eastAsia="Times New Roman" w:cs="Times New Roman"/>
+          <w:noProof w:val="0"/>
+          <w:sz w:val="20"/>
+          <w:szCs w:val="20"/>
+          <w:lang w:val="en-US"/>
+        </w:rPr>
+        <w:t xml:space="preserve">Business Development </w:t>
       </w:r>
     </w:p>
     <w:p>
@@ -5452,79 +5513,25 @@
         <w:pStyle w:val="ListParagraph"/>
         <w:numPr>
           <w:ilvl w:val="0"/>
-          <w:numId w:val="3"/>
+          <w:numId w:val="35"/>
         </w:numPr>
-        <w:tabs>
-          <w:tab w:val="left" w:leader="none" w:pos="1031"/>
-          <w:tab w:val="left" w:leader="none" w:pos="1032"/>
-        </w:tabs>
-        <w:spacing w:before="0" w:line="268" w:lineRule="exact"/>
-        <w:ind w:left="409" w:hanging="360"/>
-        <w:rPr>
-          <w:rFonts w:ascii="Times New Roman" w:hAnsi="Times New Roman" w:eastAsia="Times New Roman" w:cs="Times New Roman"/>
-          <w:b w:val="0"/>
-          <w:bCs w:val="0"/>
-          <w:i w:val="0"/>
-          <w:iCs w:val="0"/>
-          <w:caps w:val="0"/>
-          <w:smallCaps w:val="0"/>
-          <w:noProof w:val="0"/>
-          <w:color w:val="auto" w:themeColor="background1" w:themeTint="FF" w:themeShade="FF"/>
-          <w:sz w:val="20"/>
-          <w:szCs w:val="20"/>
-          <w:lang w:val="en-US"/>
-        </w:rPr>
-      </w:pPr>
-      <w:r>
-        <w:rPr>
-          <w:rFonts w:ascii="Times New Roman" w:hAnsi="Times New Roman" w:eastAsia="Times New Roman" w:cs="Times New Roman"/>
-          <w:b w:val="0"/>
-          <w:bCs w:val="0"/>
-          <w:i w:val="0"/>
-          <w:iCs w:val="0"/>
-          <w:caps w:val="0"/>
-          <w:smallCaps w:val="0"/>
-          <w:noProof w:val="0"/>
-          <w:color w:val="auto"/>
-          <w:sz w:val="20"/>
-          <w:szCs w:val="20"/>
-          <w:lang w:val="en-US"/>
-        </w:rPr>
-        <w:t xml:space="preserve">General Maintenance of Edel Quinn Hall and surrounding </w:t>
-      </w:r>
-      <w:r>
-        <w:rPr>
-          <w:rFonts w:ascii="Times New Roman" w:hAnsi="Times New Roman" w:eastAsia="Times New Roman" w:cs="Times New Roman"/>
-          <w:b w:val="0"/>
-          <w:bCs w:val="0"/>
-          <w:i w:val="0"/>
-          <w:iCs w:val="0"/>
-          <w:caps w:val="0"/>
-          <w:smallCaps w:val="0"/>
-          <w:noProof w:val="0"/>
-          <w:color w:val="auto"/>
-          <w:sz w:val="20"/>
-          <w:szCs w:val="20"/>
-          <w:lang w:val="en-US"/>
-        </w:rPr>
-        <w:t>areas</w:t>
-      </w:r>
-      <w:r>
-        <w:rPr>
-          <w:rFonts w:ascii="Times New Roman" w:hAnsi="Times New Roman" w:eastAsia="Times New Roman" w:cs="Times New Roman"/>
-          <w:b w:val="0"/>
-          <w:bCs w:val="0"/>
-          <w:i w:val="0"/>
-          <w:iCs w:val="0"/>
-          <w:caps w:val="0"/>
-          <w:smallCaps w:val="0"/>
-          <w:noProof w:val="0"/>
-          <w:color w:val="auto"/>
-          <w:sz w:val="20"/>
-          <w:szCs w:val="20"/>
-          <w:lang w:val="en-US"/>
-        </w:rPr>
-        <w:t>.</w:t>
+        <w:rPr>
+          <w:rFonts w:ascii="Times New Roman" w:hAnsi="Times New Roman" w:eastAsia="Times New Roman" w:cs="Times New Roman"/>
+          <w:noProof w:val="0"/>
+          <w:sz w:val="20"/>
+          <w:szCs w:val="20"/>
+          <w:lang w:val="en-US"/>
+        </w:rPr>
+      </w:pPr>
+      <w:r>
+        <w:rPr>
+          <w:rFonts w:ascii="Times New Roman" w:hAnsi="Times New Roman" w:eastAsia="Times New Roman" w:cs="Times New Roman"/>
+          <w:noProof w:val="0"/>
+          <w:sz w:val="20"/>
+          <w:szCs w:val="20"/>
+          <w:lang w:val="en-US"/>
+        </w:rPr>
+        <w:t xml:space="preserve">Responsible for automating the office. </w:t>
       </w:r>
     </w:p>
     <w:p>
@@ -5532,169 +5539,7 @@
         <w:pStyle w:val="ListParagraph"/>
         <w:numPr>
           <w:ilvl w:val="0"/>
-          <w:numId w:val="3"/>
-        </w:numPr>
-        <w:tabs>
-          <w:tab w:val="left" w:leader="none" w:pos="1031"/>
-          <w:tab w:val="left" w:leader="none" w:pos="1032"/>
-        </w:tabs>
-        <w:spacing w:before="0" w:line="269" w:lineRule="exact"/>
-        <w:ind w:left="409" w:hanging="360"/>
-        <w:rPr>
-          <w:rFonts w:ascii="Times New Roman" w:hAnsi="Times New Roman" w:eastAsia="Times New Roman" w:cs="Times New Roman"/>
-          <w:b w:val="0"/>
-          <w:bCs w:val="0"/>
-          <w:i w:val="0"/>
-          <w:iCs w:val="0"/>
-          <w:caps w:val="0"/>
-          <w:smallCaps w:val="0"/>
-          <w:noProof w:val="0"/>
-          <w:color w:val="auto" w:themeColor="background1" w:themeTint="FF" w:themeShade="FF"/>
-          <w:sz w:val="20"/>
-          <w:szCs w:val="20"/>
-          <w:lang w:val="en-US"/>
-        </w:rPr>
-      </w:pPr>
-      <w:r>
-        <w:rPr>
-          <w:rFonts w:ascii="Times New Roman" w:hAnsi="Times New Roman" w:eastAsia="Times New Roman" w:cs="Times New Roman"/>
-          <w:b w:val="0"/>
-          <w:bCs w:val="0"/>
-          <w:i w:val="0"/>
-          <w:iCs w:val="0"/>
-          <w:caps w:val="0"/>
-          <w:smallCaps w:val="0"/>
-          <w:noProof w:val="0"/>
-          <w:color w:val="auto"/>
-          <w:sz w:val="20"/>
-          <w:szCs w:val="20"/>
-          <w:lang w:val="en-US"/>
-        </w:rPr>
-        <w:t>Event Management – weekly bingo, dramas, dances, functions etc.</w:t>
-      </w:r>
-    </w:p>
-    <w:p>
-      <w:pPr>
-        <w:pStyle w:val="ListParagraph"/>
-        <w:numPr>
-          <w:ilvl w:val="0"/>
-          <w:numId w:val="3"/>
-        </w:numPr>
-        <w:tabs>
-          <w:tab w:val="left" w:leader="none" w:pos="1031"/>
-          <w:tab w:val="left" w:leader="none" w:pos="1032"/>
-        </w:tabs>
-        <w:spacing w:before="0" w:line="269" w:lineRule="exact"/>
-        <w:ind w:left="409" w:hanging="360"/>
-        <w:rPr>
-          <w:rFonts w:ascii="Times New Roman" w:hAnsi="Times New Roman" w:eastAsia="Times New Roman" w:cs="Times New Roman"/>
-          <w:b w:val="0"/>
-          <w:bCs w:val="0"/>
-          <w:noProof w:val="0"/>
-          <w:color w:val="auto"/>
-          <w:sz w:val="20"/>
-          <w:szCs w:val="20"/>
-          <w:lang w:val="en-US"/>
-        </w:rPr>
-      </w:pPr>
-      <w:r>
-        <w:rPr>
-          <w:rFonts w:ascii="Times New Roman" w:hAnsi="Times New Roman" w:eastAsia="Times New Roman" w:cs="Times New Roman"/>
-          <w:b w:val="0"/>
-          <w:bCs w:val="0"/>
-          <w:noProof w:val="0"/>
-          <w:color w:val="auto"/>
-          <w:sz w:val="20"/>
-          <w:szCs w:val="20"/>
-          <w:lang w:val="en-US"/>
-        </w:rPr>
-        <w:t>Inventory control of shop and bar</w:t>
-      </w:r>
-    </w:p>
-    <w:p>
-      <w:pPr>
-        <w:pStyle w:val="Heading2"/>
-        <w:rPr>
-          <w:rFonts w:ascii="Times New Roman" w:hAnsi="Times New Roman" w:eastAsia="Times New Roman" w:cs="Times New Roman"/>
-          <w:b w:val="1"/>
-          <w:bCs w:val="1"/>
-          <w:noProof w:val="0"/>
-          <w:sz w:val="24"/>
-          <w:szCs w:val="24"/>
-          <w:lang w:val="en-US"/>
-        </w:rPr>
-      </w:pPr>
-      <w:r>
-        <w:rPr>
-          <w:rFonts w:ascii="Times New Roman" w:hAnsi="Times New Roman" w:eastAsia="Times New Roman" w:cs="Times New Roman"/>
-          <w:b w:val="1"/>
-          <w:bCs w:val="1"/>
-          <w:noProof w:val="0"/>
-          <w:sz w:val="24"/>
-          <w:szCs w:val="24"/>
-          <w:lang w:val="en-US"/>
-        </w:rPr>
-        <w:t>I.D.C. Ltd, 2006 – 2009</w:t>
-      </w:r>
-    </w:p>
-    <w:p>
-      <w:pPr>
-        <w:pStyle w:val="ListParagraph"/>
-        <w:numPr>
-          <w:ilvl w:val="0"/>
-          <w:numId w:val="11"/>
-        </w:numPr>
-        <w:rPr>
-          <w:rFonts w:ascii="Times New Roman" w:hAnsi="Times New Roman" w:eastAsia="Times New Roman" w:cs="Times New Roman"/>
-          <w:noProof w:val="0"/>
-          <w:sz w:val="20"/>
-          <w:szCs w:val="20"/>
-          <w:lang w:val="en-US"/>
-        </w:rPr>
-      </w:pPr>
-      <w:r>
-        <w:rPr>
-          <w:rFonts w:ascii="Times New Roman" w:hAnsi="Times New Roman" w:eastAsia="Times New Roman" w:cs="Times New Roman"/>
-          <w:noProof w:val="0"/>
-          <w:sz w:val="20"/>
-          <w:szCs w:val="20"/>
-          <w:lang w:val="en-US"/>
-        </w:rPr>
-        <w:t xml:space="preserve">Business Development </w:t>
-      </w:r>
-    </w:p>
-    <w:p>
-      <w:pPr>
-        <w:pStyle w:val="ListParagraph"/>
-        <w:numPr>
-          <w:ilvl w:val="0"/>
-          <w:numId w:val="11"/>
-        </w:numPr>
-        <w:rPr>
-          <w:rFonts w:ascii="Times New Roman" w:hAnsi="Times New Roman" w:eastAsia="Times New Roman" w:cs="Times New Roman"/>
-          <w:noProof w:val="0"/>
-          <w:sz w:val="20"/>
-          <w:szCs w:val="20"/>
-          <w:lang w:val="en-US"/>
-        </w:rPr>
-      </w:pPr>
-      <w:r>
-        <w:rPr>
-          <w:rFonts w:ascii="Times New Roman" w:hAnsi="Times New Roman" w:eastAsia="Times New Roman" w:cs="Times New Roman"/>
-          <w:noProof w:val="0"/>
-          <w:sz w:val="20"/>
-          <w:szCs w:val="20"/>
-          <w:lang w:val="en-US"/>
-        </w:rPr>
-        <w:t xml:space="preserve">Responsible for automating the office. </w:t>
-      </w:r>
-    </w:p>
-    <w:p>
-      <w:pPr>
-        <w:pStyle w:val="ListParagraph"/>
-        <w:numPr>
-          <w:ilvl w:val="0"/>
-          <w:numId w:val="11"/>
+          <w:numId w:val="35"/>
         </w:numPr>
         <w:rPr>
           <w:rFonts w:ascii="Times New Roman" w:hAnsi="Times New Roman" w:eastAsia="Times New Roman" w:cs="Times New Roman"/>
@@ -7118,7 +6963,9 @@
         </w:rPr>
       </w:pPr>
     </w:p>
-    <w:p/>
+    <w:p>
+      <w:pPr/>
+    </w:p>
     <w:sectPr>
       <w:pgSz w:w="12240" w:h="15840" w:orient="portrait"/>
       <w:pgMar w:top="1440" w:right="1440" w:bottom="1440" w:left="1440" w:header="720" w:footer="720" w:gutter="0"/>
@@ -7142,6 +6989,2277 @@
 
 <file path=word/numbering.xml><?xml version="1.0" encoding="utf-8"?>
 <w:numbering xmlns:w="http://schemas.openxmlformats.org/wordprocessingml/2006/main">
+  <w:abstractNum xmlns:w="http://schemas.openxmlformats.org/wordprocessingml/2006/main" w:abstractNumId="37">
+    <w:nsid w:val="74bcf351"/>
+    <w:multiLevelType xmlns:w="http://schemas.openxmlformats.org/wordprocessingml/2006/main" w:val="hybridMultilevel"/>
+    <w:lvl xmlns:w="http://schemas.openxmlformats.org/wordprocessingml/2006/main" w:ilvl="0">
+      <w:start w:val="1"/>
+      <w:numFmt w:val="bullet"/>
+      <w:lvlText w:val=""/>
+      <w:lvlJc w:val="left"/>
+      <w:pPr>
+        <w:ind w:left="720" w:hanging="360"/>
+      </w:pPr>
+      <w:rPr>
+        <w:rFonts w:hint="default" w:ascii="Wingdings" w:hAnsi="Wingdings"/>
+      </w:rPr>
+    </w:lvl>
+    <w:lvl xmlns:w="http://schemas.openxmlformats.org/wordprocessingml/2006/main" w:ilvl="1">
+      <w:start w:val="1"/>
+      <w:numFmt w:val="bullet"/>
+      <w:lvlText w:val="o"/>
+      <w:lvlJc w:val="left"/>
+      <w:pPr>
+        <w:ind w:left="1440" w:hanging="360"/>
+      </w:pPr>
+      <w:rPr>
+        <w:rFonts w:hint="default" w:ascii="Courier New" w:hAnsi="Courier New"/>
+      </w:rPr>
+    </w:lvl>
+    <w:lvl xmlns:w="http://schemas.openxmlformats.org/wordprocessingml/2006/main" w:ilvl="2">
+      <w:start w:val="1"/>
+      <w:numFmt w:val="bullet"/>
+      <w:lvlText w:val=""/>
+      <w:lvlJc w:val="left"/>
+      <w:pPr>
+        <w:ind w:left="2160" w:hanging="360"/>
+      </w:pPr>
+      <w:rPr>
+        <w:rFonts w:hint="default" w:ascii="Wingdings" w:hAnsi="Wingdings"/>
+      </w:rPr>
+    </w:lvl>
+    <w:lvl xmlns:w="http://schemas.openxmlformats.org/wordprocessingml/2006/main" w:ilvl="3">
+      <w:start w:val="1"/>
+      <w:numFmt w:val="bullet"/>
+      <w:lvlText w:val=""/>
+      <w:lvlJc w:val="left"/>
+      <w:pPr>
+        <w:ind w:left="2880" w:hanging="360"/>
+      </w:pPr>
+      <w:rPr>
+        <w:rFonts w:hint="default" w:ascii="Symbol" w:hAnsi="Symbol"/>
+      </w:rPr>
+    </w:lvl>
+    <w:lvl xmlns:w="http://schemas.openxmlformats.org/wordprocessingml/2006/main" w:ilvl="4">
+      <w:start w:val="1"/>
+      <w:numFmt w:val="bullet"/>
+      <w:lvlText w:val="o"/>
+      <w:lvlJc w:val="left"/>
+      <w:pPr>
+        <w:ind w:left="3600" w:hanging="360"/>
+      </w:pPr>
+      <w:rPr>
+        <w:rFonts w:hint="default" w:ascii="Courier New" w:hAnsi="Courier New"/>
+      </w:rPr>
+    </w:lvl>
+    <w:lvl xmlns:w="http://schemas.openxmlformats.org/wordprocessingml/2006/main" w:ilvl="5">
+      <w:start w:val="1"/>
+      <w:numFmt w:val="bullet"/>
+      <w:lvlText w:val=""/>
+      <w:lvlJc w:val="left"/>
+      <w:pPr>
+        <w:ind w:left="4320" w:hanging="360"/>
+      </w:pPr>
+      <w:rPr>
+        <w:rFonts w:hint="default" w:ascii="Wingdings" w:hAnsi="Wingdings"/>
+      </w:rPr>
+    </w:lvl>
+    <w:lvl xmlns:w="http://schemas.openxmlformats.org/wordprocessingml/2006/main" w:ilvl="6">
+      <w:start w:val="1"/>
+      <w:numFmt w:val="bullet"/>
+      <w:lvlText w:val=""/>
+      <w:lvlJc w:val="left"/>
+      <w:pPr>
+        <w:ind w:left="5040" w:hanging="360"/>
+      </w:pPr>
+      <w:rPr>
+        <w:rFonts w:hint="default" w:ascii="Symbol" w:hAnsi="Symbol"/>
+      </w:rPr>
+    </w:lvl>
+    <w:lvl xmlns:w="http://schemas.openxmlformats.org/wordprocessingml/2006/main" w:ilvl="7">
+      <w:start w:val="1"/>
+      <w:numFmt w:val="bullet"/>
+      <w:lvlText w:val="o"/>
+      <w:lvlJc w:val="left"/>
+      <w:pPr>
+        <w:ind w:left="5760" w:hanging="360"/>
+      </w:pPr>
+      <w:rPr>
+        <w:rFonts w:hint="default" w:ascii="Courier New" w:hAnsi="Courier New"/>
+      </w:rPr>
+    </w:lvl>
+    <w:lvl xmlns:w="http://schemas.openxmlformats.org/wordprocessingml/2006/main" w:ilvl="8">
+      <w:start w:val="1"/>
+      <w:numFmt w:val="bullet"/>
+      <w:lvlText w:val=""/>
+      <w:lvlJc w:val="left"/>
+      <w:pPr>
+        <w:ind w:left="6480" w:hanging="360"/>
+      </w:pPr>
+      <w:rPr>
+        <w:rFonts w:hint="default" w:ascii="Wingdings" w:hAnsi="Wingdings"/>
+      </w:rPr>
+    </w:lvl>
+  </w:abstractNum>
+  <w:abstractNum xmlns:w="http://schemas.openxmlformats.org/wordprocessingml/2006/main" w:abstractNumId="36">
+    <w:nsid w:val="6152b2f5"/>
+    <w:multiLevelType xmlns:w="http://schemas.openxmlformats.org/wordprocessingml/2006/main" w:val="hybridMultilevel"/>
+    <w:lvl xmlns:w="http://schemas.openxmlformats.org/wordprocessingml/2006/main" w:ilvl="0">
+      <w:start w:val="1"/>
+      <w:numFmt w:val="bullet"/>
+      <w:lvlText w:val=""/>
+      <w:lvlJc w:val="left"/>
+      <w:pPr>
+        <w:ind w:left="1080" w:hanging="360"/>
+      </w:pPr>
+      <w:rPr>
+        <w:rFonts w:hint="default" w:ascii="Wingdings" w:hAnsi="Wingdings"/>
+      </w:rPr>
+    </w:lvl>
+    <w:lvl xmlns:w="http://schemas.openxmlformats.org/wordprocessingml/2006/main" w:ilvl="1">
+      <w:start w:val="1"/>
+      <w:numFmt w:val="bullet"/>
+      <w:lvlText w:val="o"/>
+      <w:lvlJc w:val="left"/>
+      <w:pPr>
+        <w:ind w:left="1800" w:hanging="360"/>
+      </w:pPr>
+      <w:rPr>
+        <w:rFonts w:hint="default" w:ascii="Courier New" w:hAnsi="Courier New"/>
+      </w:rPr>
+    </w:lvl>
+    <w:lvl xmlns:w="http://schemas.openxmlformats.org/wordprocessingml/2006/main" w:ilvl="2">
+      <w:start w:val="1"/>
+      <w:numFmt w:val="bullet"/>
+      <w:lvlText w:val=""/>
+      <w:lvlJc w:val="left"/>
+      <w:pPr>
+        <w:ind w:left="2520" w:hanging="360"/>
+      </w:pPr>
+      <w:rPr>
+        <w:rFonts w:hint="default" w:ascii="Wingdings" w:hAnsi="Wingdings"/>
+      </w:rPr>
+    </w:lvl>
+    <w:lvl xmlns:w="http://schemas.openxmlformats.org/wordprocessingml/2006/main" w:ilvl="3">
+      <w:start w:val="1"/>
+      <w:numFmt w:val="bullet"/>
+      <w:lvlText w:val=""/>
+      <w:lvlJc w:val="left"/>
+      <w:pPr>
+        <w:ind w:left="3240" w:hanging="360"/>
+      </w:pPr>
+      <w:rPr>
+        <w:rFonts w:hint="default" w:ascii="Symbol" w:hAnsi="Symbol"/>
+      </w:rPr>
+    </w:lvl>
+    <w:lvl xmlns:w="http://schemas.openxmlformats.org/wordprocessingml/2006/main" w:ilvl="4">
+      <w:start w:val="1"/>
+      <w:numFmt w:val="bullet"/>
+      <w:lvlText w:val="o"/>
+      <w:lvlJc w:val="left"/>
+      <w:pPr>
+        <w:ind w:left="3960" w:hanging="360"/>
+      </w:pPr>
+      <w:rPr>
+        <w:rFonts w:hint="default" w:ascii="Courier New" w:hAnsi="Courier New"/>
+      </w:rPr>
+    </w:lvl>
+    <w:lvl xmlns:w="http://schemas.openxmlformats.org/wordprocessingml/2006/main" w:ilvl="5">
+      <w:start w:val="1"/>
+      <w:numFmt w:val="bullet"/>
+      <w:lvlText w:val=""/>
+      <w:lvlJc w:val="left"/>
+      <w:pPr>
+        <w:ind w:left="4680" w:hanging="360"/>
+      </w:pPr>
+      <w:rPr>
+        <w:rFonts w:hint="default" w:ascii="Wingdings" w:hAnsi="Wingdings"/>
+      </w:rPr>
+    </w:lvl>
+    <w:lvl xmlns:w="http://schemas.openxmlformats.org/wordprocessingml/2006/main" w:ilvl="6">
+      <w:start w:val="1"/>
+      <w:numFmt w:val="bullet"/>
+      <w:lvlText w:val=""/>
+      <w:lvlJc w:val="left"/>
+      <w:pPr>
+        <w:ind w:left="5400" w:hanging="360"/>
+      </w:pPr>
+      <w:rPr>
+        <w:rFonts w:hint="default" w:ascii="Symbol" w:hAnsi="Symbol"/>
+      </w:rPr>
+    </w:lvl>
+    <w:lvl xmlns:w="http://schemas.openxmlformats.org/wordprocessingml/2006/main" w:ilvl="7">
+      <w:start w:val="1"/>
+      <w:numFmt w:val="bullet"/>
+      <w:lvlText w:val="o"/>
+      <w:lvlJc w:val="left"/>
+      <w:pPr>
+        <w:ind w:left="6120" w:hanging="360"/>
+      </w:pPr>
+      <w:rPr>
+        <w:rFonts w:hint="default" w:ascii="Courier New" w:hAnsi="Courier New"/>
+      </w:rPr>
+    </w:lvl>
+    <w:lvl xmlns:w="http://schemas.openxmlformats.org/wordprocessingml/2006/main" w:ilvl="8">
+      <w:start w:val="1"/>
+      <w:numFmt w:val="bullet"/>
+      <w:lvlText w:val=""/>
+      <w:lvlJc w:val="left"/>
+      <w:pPr>
+        <w:ind w:left="6840" w:hanging="360"/>
+      </w:pPr>
+      <w:rPr>
+        <w:rFonts w:hint="default" w:ascii="Wingdings" w:hAnsi="Wingdings"/>
+      </w:rPr>
+    </w:lvl>
+  </w:abstractNum>
+  <w:abstractNum xmlns:w="http://schemas.openxmlformats.org/wordprocessingml/2006/main" w:abstractNumId="35">
+    <w:nsid w:val="217973f3"/>
+    <w:multiLevelType xmlns:w="http://schemas.openxmlformats.org/wordprocessingml/2006/main" w:val="hybridMultilevel"/>
+    <w:lvl xmlns:w="http://schemas.openxmlformats.org/wordprocessingml/2006/main" w:ilvl="0">
+      <w:start w:val="1"/>
+      <w:numFmt w:val="bullet"/>
+      <w:lvlText w:val=""/>
+      <w:lvlJc w:val="left"/>
+      <w:pPr>
+        <w:ind w:left="720" w:hanging="360"/>
+      </w:pPr>
+      <w:rPr>
+        <w:rFonts w:hint="default" w:ascii="Symbol" w:hAnsi="Symbol"/>
+      </w:rPr>
+    </w:lvl>
+    <w:lvl xmlns:w="http://schemas.openxmlformats.org/wordprocessingml/2006/main" w:ilvl="1">
+      <w:start w:val="1"/>
+      <w:numFmt w:val="bullet"/>
+      <w:lvlText w:val="o"/>
+      <w:lvlJc w:val="left"/>
+      <w:pPr>
+        <w:ind w:left="1440" w:hanging="360"/>
+      </w:pPr>
+      <w:rPr>
+        <w:rFonts w:hint="default" w:ascii="Courier New" w:hAnsi="Courier New"/>
+      </w:rPr>
+    </w:lvl>
+    <w:lvl xmlns:w="http://schemas.openxmlformats.org/wordprocessingml/2006/main" w:ilvl="2">
+      <w:start w:val="1"/>
+      <w:numFmt w:val="bullet"/>
+      <w:lvlText w:val=""/>
+      <w:lvlJc w:val="left"/>
+      <w:pPr>
+        <w:ind w:left="2160" w:hanging="360"/>
+      </w:pPr>
+      <w:rPr>
+        <w:rFonts w:hint="default" w:ascii="Wingdings" w:hAnsi="Wingdings"/>
+      </w:rPr>
+    </w:lvl>
+    <w:lvl xmlns:w="http://schemas.openxmlformats.org/wordprocessingml/2006/main" w:ilvl="3">
+      <w:start w:val="1"/>
+      <w:numFmt w:val="bullet"/>
+      <w:lvlText w:val=""/>
+      <w:lvlJc w:val="left"/>
+      <w:pPr>
+        <w:ind w:left="2880" w:hanging="360"/>
+      </w:pPr>
+      <w:rPr>
+        <w:rFonts w:hint="default" w:ascii="Symbol" w:hAnsi="Symbol"/>
+      </w:rPr>
+    </w:lvl>
+    <w:lvl xmlns:w="http://schemas.openxmlformats.org/wordprocessingml/2006/main" w:ilvl="4">
+      <w:start w:val="1"/>
+      <w:numFmt w:val="bullet"/>
+      <w:lvlText w:val="o"/>
+      <w:lvlJc w:val="left"/>
+      <w:pPr>
+        <w:ind w:left="3600" w:hanging="360"/>
+      </w:pPr>
+      <w:rPr>
+        <w:rFonts w:hint="default" w:ascii="Courier New" w:hAnsi="Courier New"/>
+      </w:rPr>
+    </w:lvl>
+    <w:lvl xmlns:w="http://schemas.openxmlformats.org/wordprocessingml/2006/main" w:ilvl="5">
+      <w:start w:val="1"/>
+      <w:numFmt w:val="bullet"/>
+      <w:lvlText w:val=""/>
+      <w:lvlJc w:val="left"/>
+      <w:pPr>
+        <w:ind w:left="4320" w:hanging="360"/>
+      </w:pPr>
+      <w:rPr>
+        <w:rFonts w:hint="default" w:ascii="Wingdings" w:hAnsi="Wingdings"/>
+      </w:rPr>
+    </w:lvl>
+    <w:lvl xmlns:w="http://schemas.openxmlformats.org/wordprocessingml/2006/main" w:ilvl="6">
+      <w:start w:val="1"/>
+      <w:numFmt w:val="bullet"/>
+      <w:lvlText w:val=""/>
+      <w:lvlJc w:val="left"/>
+      <w:pPr>
+        <w:ind w:left="5040" w:hanging="360"/>
+      </w:pPr>
+      <w:rPr>
+        <w:rFonts w:hint="default" w:ascii="Symbol" w:hAnsi="Symbol"/>
+      </w:rPr>
+    </w:lvl>
+    <w:lvl xmlns:w="http://schemas.openxmlformats.org/wordprocessingml/2006/main" w:ilvl="7">
+      <w:start w:val="1"/>
+      <w:numFmt w:val="bullet"/>
+      <w:lvlText w:val="o"/>
+      <w:lvlJc w:val="left"/>
+      <w:pPr>
+        <w:ind w:left="5760" w:hanging="360"/>
+      </w:pPr>
+      <w:rPr>
+        <w:rFonts w:hint="default" w:ascii="Courier New" w:hAnsi="Courier New"/>
+      </w:rPr>
+    </w:lvl>
+    <w:lvl xmlns:w="http://schemas.openxmlformats.org/wordprocessingml/2006/main" w:ilvl="8">
+      <w:start w:val="1"/>
+      <w:numFmt w:val="bullet"/>
+      <w:lvlText w:val=""/>
+      <w:lvlJc w:val="left"/>
+      <w:pPr>
+        <w:ind w:left="6480" w:hanging="360"/>
+      </w:pPr>
+      <w:rPr>
+        <w:rFonts w:hint="default" w:ascii="Wingdings" w:hAnsi="Wingdings"/>
+      </w:rPr>
+    </w:lvl>
+  </w:abstractNum>
+  <w:abstractNum xmlns:w="http://schemas.openxmlformats.org/wordprocessingml/2006/main" w:abstractNumId="34">
+    <w:nsid w:val="559f9006"/>
+    <w:multiLevelType xmlns:w="http://schemas.openxmlformats.org/wordprocessingml/2006/main" w:val="hybridMultilevel"/>
+    <w:lvl xmlns:w="http://schemas.openxmlformats.org/wordprocessingml/2006/main" w:ilvl="0">
+      <w:start w:val="1"/>
+      <w:numFmt w:val="bullet"/>
+      <w:lvlText w:val=""/>
+      <w:lvlJc w:val="left"/>
+      <w:pPr>
+        <w:ind w:left="720" w:hanging="360"/>
+      </w:pPr>
+      <w:rPr>
+        <w:rFonts w:hint="default" w:ascii="Symbol" w:hAnsi="Symbol"/>
+      </w:rPr>
+    </w:lvl>
+    <w:lvl xmlns:w="http://schemas.openxmlformats.org/wordprocessingml/2006/main" w:ilvl="1">
+      <w:start w:val="1"/>
+      <w:numFmt w:val="bullet"/>
+      <w:lvlText w:val="o"/>
+      <w:lvlJc w:val="left"/>
+      <w:pPr>
+        <w:ind w:left="1440" w:hanging="360"/>
+      </w:pPr>
+      <w:rPr>
+        <w:rFonts w:hint="default" w:ascii="Courier New" w:hAnsi="Courier New"/>
+      </w:rPr>
+    </w:lvl>
+    <w:lvl xmlns:w="http://schemas.openxmlformats.org/wordprocessingml/2006/main" w:ilvl="2">
+      <w:start w:val="1"/>
+      <w:numFmt w:val="bullet"/>
+      <w:lvlText w:val=""/>
+      <w:lvlJc w:val="left"/>
+      <w:pPr>
+        <w:ind w:left="2160" w:hanging="360"/>
+      </w:pPr>
+      <w:rPr>
+        <w:rFonts w:hint="default" w:ascii="Wingdings" w:hAnsi="Wingdings"/>
+      </w:rPr>
+    </w:lvl>
+    <w:lvl xmlns:w="http://schemas.openxmlformats.org/wordprocessingml/2006/main" w:ilvl="3">
+      <w:start w:val="1"/>
+      <w:numFmt w:val="bullet"/>
+      <w:lvlText w:val=""/>
+      <w:lvlJc w:val="left"/>
+      <w:pPr>
+        <w:ind w:left="2880" w:hanging="360"/>
+      </w:pPr>
+      <w:rPr>
+        <w:rFonts w:hint="default" w:ascii="Symbol" w:hAnsi="Symbol"/>
+      </w:rPr>
+    </w:lvl>
+    <w:lvl xmlns:w="http://schemas.openxmlformats.org/wordprocessingml/2006/main" w:ilvl="4">
+      <w:start w:val="1"/>
+      <w:numFmt w:val="bullet"/>
+      <w:lvlText w:val="o"/>
+      <w:lvlJc w:val="left"/>
+      <w:pPr>
+        <w:ind w:left="3600" w:hanging="360"/>
+      </w:pPr>
+      <w:rPr>
+        <w:rFonts w:hint="default" w:ascii="Courier New" w:hAnsi="Courier New"/>
+      </w:rPr>
+    </w:lvl>
+    <w:lvl xmlns:w="http://schemas.openxmlformats.org/wordprocessingml/2006/main" w:ilvl="5">
+      <w:start w:val="1"/>
+      <w:numFmt w:val="bullet"/>
+      <w:lvlText w:val=""/>
+      <w:lvlJc w:val="left"/>
+      <w:pPr>
+        <w:ind w:left="4320" w:hanging="360"/>
+      </w:pPr>
+      <w:rPr>
+        <w:rFonts w:hint="default" w:ascii="Wingdings" w:hAnsi="Wingdings"/>
+      </w:rPr>
+    </w:lvl>
+    <w:lvl xmlns:w="http://schemas.openxmlformats.org/wordprocessingml/2006/main" w:ilvl="6">
+      <w:start w:val="1"/>
+      <w:numFmt w:val="bullet"/>
+      <w:lvlText w:val=""/>
+      <w:lvlJc w:val="left"/>
+      <w:pPr>
+        <w:ind w:left="5040" w:hanging="360"/>
+      </w:pPr>
+      <w:rPr>
+        <w:rFonts w:hint="default" w:ascii="Symbol" w:hAnsi="Symbol"/>
+      </w:rPr>
+    </w:lvl>
+    <w:lvl xmlns:w="http://schemas.openxmlformats.org/wordprocessingml/2006/main" w:ilvl="7">
+      <w:start w:val="1"/>
+      <w:numFmt w:val="bullet"/>
+      <w:lvlText w:val="o"/>
+      <w:lvlJc w:val="left"/>
+      <w:pPr>
+        <w:ind w:left="5760" w:hanging="360"/>
+      </w:pPr>
+      <w:rPr>
+        <w:rFonts w:hint="default" w:ascii="Courier New" w:hAnsi="Courier New"/>
+      </w:rPr>
+    </w:lvl>
+    <w:lvl xmlns:w="http://schemas.openxmlformats.org/wordprocessingml/2006/main" w:ilvl="8">
+      <w:start w:val="1"/>
+      <w:numFmt w:val="bullet"/>
+      <w:lvlText w:val=""/>
+      <w:lvlJc w:val="left"/>
+      <w:pPr>
+        <w:ind w:left="6480" w:hanging="360"/>
+      </w:pPr>
+      <w:rPr>
+        <w:rFonts w:hint="default" w:ascii="Wingdings" w:hAnsi="Wingdings"/>
+      </w:rPr>
+    </w:lvl>
+  </w:abstractNum>
+  <w:abstractNum xmlns:w="http://schemas.openxmlformats.org/wordprocessingml/2006/main" w:abstractNumId="33">
+    <w:nsid w:val="3ac15047"/>
+    <w:multiLevelType xmlns:w="http://schemas.openxmlformats.org/wordprocessingml/2006/main" w:val="hybridMultilevel"/>
+    <w:lvl xmlns:w="http://schemas.openxmlformats.org/wordprocessingml/2006/main" w:ilvl="0">
+      <w:start w:val="1"/>
+      <w:numFmt w:val="decimal"/>
+      <w:lvlText w:val="%1."/>
+      <w:lvlJc w:val="left"/>
+      <w:pPr>
+        <w:ind w:left="720" w:hanging="360"/>
+      </w:pPr>
+    </w:lvl>
+    <w:lvl xmlns:w="http://schemas.openxmlformats.org/wordprocessingml/2006/main" w:ilvl="1">
+      <w:start w:val="1"/>
+      <w:numFmt w:val="lowerLetter"/>
+      <w:lvlText w:val="%2."/>
+      <w:lvlJc w:val="left"/>
+      <w:pPr>
+        <w:ind w:left="1440" w:hanging="360"/>
+      </w:pPr>
+    </w:lvl>
+    <w:lvl xmlns:w="http://schemas.openxmlformats.org/wordprocessingml/2006/main" w:ilvl="2">
+      <w:start w:val="1"/>
+      <w:numFmt w:val="lowerRoman"/>
+      <w:lvlText w:val="%3."/>
+      <w:lvlJc w:val="right"/>
+      <w:pPr>
+        <w:ind w:left="2160" w:hanging="180"/>
+      </w:pPr>
+    </w:lvl>
+    <w:lvl xmlns:w="http://schemas.openxmlformats.org/wordprocessingml/2006/main" w:ilvl="3">
+      <w:start w:val="1"/>
+      <w:numFmt w:val="decimal"/>
+      <w:lvlText w:val="%4."/>
+      <w:lvlJc w:val="left"/>
+      <w:pPr>
+        <w:ind w:left="2880" w:hanging="360"/>
+      </w:pPr>
+    </w:lvl>
+    <w:lvl xmlns:w="http://schemas.openxmlformats.org/wordprocessingml/2006/main" w:ilvl="4">
+      <w:start w:val="1"/>
+      <w:numFmt w:val="lowerLetter"/>
+      <w:lvlText w:val="%5."/>
+      <w:lvlJc w:val="left"/>
+      <w:pPr>
+        <w:ind w:left="3600" w:hanging="360"/>
+      </w:pPr>
+    </w:lvl>
+    <w:lvl xmlns:w="http://schemas.openxmlformats.org/wordprocessingml/2006/main" w:ilvl="5">
+      <w:start w:val="1"/>
+      <w:numFmt w:val="lowerRoman"/>
+      <w:lvlText w:val="%6."/>
+      <w:lvlJc w:val="right"/>
+      <w:pPr>
+        <w:ind w:left="4320" w:hanging="180"/>
+      </w:pPr>
+    </w:lvl>
+    <w:lvl xmlns:w="http://schemas.openxmlformats.org/wordprocessingml/2006/main" w:ilvl="6">
+      <w:start w:val="1"/>
+      <w:numFmt w:val="decimal"/>
+      <w:lvlText w:val="%7."/>
+      <w:lvlJc w:val="left"/>
+      <w:pPr>
+        <w:ind w:left="5040" w:hanging="360"/>
+      </w:pPr>
+    </w:lvl>
+    <w:lvl xmlns:w="http://schemas.openxmlformats.org/wordprocessingml/2006/main" w:ilvl="7">
+      <w:start w:val="1"/>
+      <w:numFmt w:val="lowerLetter"/>
+      <w:lvlText w:val="%8."/>
+      <w:lvlJc w:val="left"/>
+      <w:pPr>
+        <w:ind w:left="5760" w:hanging="360"/>
+      </w:pPr>
+    </w:lvl>
+    <w:lvl xmlns:w="http://schemas.openxmlformats.org/wordprocessingml/2006/main" w:ilvl="8">
+      <w:start w:val="1"/>
+      <w:numFmt w:val="lowerRoman"/>
+      <w:lvlText w:val="%9."/>
+      <w:lvlJc w:val="right"/>
+      <w:pPr>
+        <w:ind w:left="6480" w:hanging="180"/>
+      </w:pPr>
+    </w:lvl>
+  </w:abstractNum>
+  <w:abstractNum xmlns:w="http://schemas.openxmlformats.org/wordprocessingml/2006/main" w:abstractNumId="32">
+    <w:nsid w:val="2594d1ea"/>
+    <w:multiLevelType xmlns:w="http://schemas.openxmlformats.org/wordprocessingml/2006/main" w:val="hybridMultilevel"/>
+    <w:lvl xmlns:w="http://schemas.openxmlformats.org/wordprocessingml/2006/main" w:ilvl="0">
+      <w:start w:val="1"/>
+      <w:numFmt w:val="bullet"/>
+      <w:lvlText w:val=""/>
+      <w:lvlJc w:val="left"/>
+      <w:pPr>
+        <w:ind w:left="720" w:hanging="360"/>
+      </w:pPr>
+      <w:rPr>
+        <w:rFonts w:hint="default" w:ascii="Symbol" w:hAnsi="Symbol"/>
+      </w:rPr>
+    </w:lvl>
+    <w:lvl xmlns:w="http://schemas.openxmlformats.org/wordprocessingml/2006/main" w:ilvl="1">
+      <w:start w:val="1"/>
+      <w:numFmt w:val="bullet"/>
+      <w:lvlText w:val="o"/>
+      <w:lvlJc w:val="left"/>
+      <w:pPr>
+        <w:ind w:left="1440" w:hanging="360"/>
+      </w:pPr>
+      <w:rPr>
+        <w:rFonts w:hint="default" w:ascii="Courier New" w:hAnsi="Courier New"/>
+      </w:rPr>
+    </w:lvl>
+    <w:lvl xmlns:w="http://schemas.openxmlformats.org/wordprocessingml/2006/main" w:ilvl="2">
+      <w:start w:val="1"/>
+      <w:numFmt w:val="bullet"/>
+      <w:lvlText w:val=""/>
+      <w:lvlJc w:val="left"/>
+      <w:pPr>
+        <w:ind w:left="2160" w:hanging="360"/>
+      </w:pPr>
+      <w:rPr>
+        <w:rFonts w:hint="default" w:ascii="Wingdings" w:hAnsi="Wingdings"/>
+      </w:rPr>
+    </w:lvl>
+    <w:lvl xmlns:w="http://schemas.openxmlformats.org/wordprocessingml/2006/main" w:ilvl="3">
+      <w:start w:val="1"/>
+      <w:numFmt w:val="bullet"/>
+      <w:lvlText w:val=""/>
+      <w:lvlJc w:val="left"/>
+      <w:pPr>
+        <w:ind w:left="2880" w:hanging="360"/>
+      </w:pPr>
+      <w:rPr>
+        <w:rFonts w:hint="default" w:ascii="Symbol" w:hAnsi="Symbol"/>
+      </w:rPr>
+    </w:lvl>
+    <w:lvl xmlns:w="http://schemas.openxmlformats.org/wordprocessingml/2006/main" w:ilvl="4">
+      <w:start w:val="1"/>
+      <w:numFmt w:val="bullet"/>
+      <w:lvlText w:val="o"/>
+      <w:lvlJc w:val="left"/>
+      <w:pPr>
+        <w:ind w:left="3600" w:hanging="360"/>
+      </w:pPr>
+      <w:rPr>
+        <w:rFonts w:hint="default" w:ascii="Courier New" w:hAnsi="Courier New"/>
+      </w:rPr>
+    </w:lvl>
+    <w:lvl xmlns:w="http://schemas.openxmlformats.org/wordprocessingml/2006/main" w:ilvl="5">
+      <w:start w:val="1"/>
+      <w:numFmt w:val="bullet"/>
+      <w:lvlText w:val=""/>
+      <w:lvlJc w:val="left"/>
+      <w:pPr>
+        <w:ind w:left="4320" w:hanging="360"/>
+      </w:pPr>
+      <w:rPr>
+        <w:rFonts w:hint="default" w:ascii="Wingdings" w:hAnsi="Wingdings"/>
+      </w:rPr>
+    </w:lvl>
+    <w:lvl xmlns:w="http://schemas.openxmlformats.org/wordprocessingml/2006/main" w:ilvl="6">
+      <w:start w:val="1"/>
+      <w:numFmt w:val="bullet"/>
+      <w:lvlText w:val=""/>
+      <w:lvlJc w:val="left"/>
+      <w:pPr>
+        <w:ind w:left="5040" w:hanging="360"/>
+      </w:pPr>
+      <w:rPr>
+        <w:rFonts w:hint="default" w:ascii="Symbol" w:hAnsi="Symbol"/>
+      </w:rPr>
+    </w:lvl>
+    <w:lvl xmlns:w="http://schemas.openxmlformats.org/wordprocessingml/2006/main" w:ilvl="7">
+      <w:start w:val="1"/>
+      <w:numFmt w:val="bullet"/>
+      <w:lvlText w:val="o"/>
+      <w:lvlJc w:val="left"/>
+      <w:pPr>
+        <w:ind w:left="5760" w:hanging="360"/>
+      </w:pPr>
+      <w:rPr>
+        <w:rFonts w:hint="default" w:ascii="Courier New" w:hAnsi="Courier New"/>
+      </w:rPr>
+    </w:lvl>
+    <w:lvl xmlns:w="http://schemas.openxmlformats.org/wordprocessingml/2006/main" w:ilvl="8">
+      <w:start w:val="1"/>
+      <w:numFmt w:val="bullet"/>
+      <w:lvlText w:val=""/>
+      <w:lvlJc w:val="left"/>
+      <w:pPr>
+        <w:ind w:left="6480" w:hanging="360"/>
+      </w:pPr>
+      <w:rPr>
+        <w:rFonts w:hint="default" w:ascii="Wingdings" w:hAnsi="Wingdings"/>
+      </w:rPr>
+    </w:lvl>
+  </w:abstractNum>
+  <w:abstractNum xmlns:w="http://schemas.openxmlformats.org/wordprocessingml/2006/main" w:abstractNumId="31">
+    <w:nsid w:val="b3ef76b"/>
+    <w:multiLevelType xmlns:w="http://schemas.openxmlformats.org/wordprocessingml/2006/main" w:val="hybridMultilevel"/>
+    <w:lvl xmlns:w="http://schemas.openxmlformats.org/wordprocessingml/2006/main" w:ilvl="0">
+      <w:start w:val="1"/>
+      <w:numFmt w:val="bullet"/>
+      <w:lvlText w:val=""/>
+      <w:lvlJc w:val="left"/>
+      <w:pPr>
+        <w:ind w:left="720" w:hanging="360"/>
+      </w:pPr>
+      <w:rPr>
+        <w:rFonts w:hint="default" w:ascii="Symbol" w:hAnsi="Symbol"/>
+      </w:rPr>
+    </w:lvl>
+    <w:lvl xmlns:w="http://schemas.openxmlformats.org/wordprocessingml/2006/main" w:ilvl="1">
+      <w:start w:val="1"/>
+      <w:numFmt w:val="bullet"/>
+      <w:lvlText w:val="o"/>
+      <w:lvlJc w:val="left"/>
+      <w:pPr>
+        <w:ind w:left="1440" w:hanging="360"/>
+      </w:pPr>
+      <w:rPr>
+        <w:rFonts w:hint="default" w:ascii="Courier New" w:hAnsi="Courier New"/>
+      </w:rPr>
+    </w:lvl>
+    <w:lvl xmlns:w="http://schemas.openxmlformats.org/wordprocessingml/2006/main" w:ilvl="2">
+      <w:start w:val="1"/>
+      <w:numFmt w:val="bullet"/>
+      <w:lvlText w:val=""/>
+      <w:lvlJc w:val="left"/>
+      <w:pPr>
+        <w:ind w:left="2160" w:hanging="360"/>
+      </w:pPr>
+      <w:rPr>
+        <w:rFonts w:hint="default" w:ascii="Wingdings" w:hAnsi="Wingdings"/>
+      </w:rPr>
+    </w:lvl>
+    <w:lvl xmlns:w="http://schemas.openxmlformats.org/wordprocessingml/2006/main" w:ilvl="3">
+      <w:start w:val="1"/>
+      <w:numFmt w:val="bullet"/>
+      <w:lvlText w:val=""/>
+      <w:lvlJc w:val="left"/>
+      <w:pPr>
+        <w:ind w:left="2880" w:hanging="360"/>
+      </w:pPr>
+      <w:rPr>
+        <w:rFonts w:hint="default" w:ascii="Symbol" w:hAnsi="Symbol"/>
+      </w:rPr>
+    </w:lvl>
+    <w:lvl xmlns:w="http://schemas.openxmlformats.org/wordprocessingml/2006/main" w:ilvl="4">
+      <w:start w:val="1"/>
+      <w:numFmt w:val="bullet"/>
+      <w:lvlText w:val="o"/>
+      <w:lvlJc w:val="left"/>
+      <w:pPr>
+        <w:ind w:left="3600" w:hanging="360"/>
+      </w:pPr>
+      <w:rPr>
+        <w:rFonts w:hint="default" w:ascii="Courier New" w:hAnsi="Courier New"/>
+      </w:rPr>
+    </w:lvl>
+    <w:lvl xmlns:w="http://schemas.openxmlformats.org/wordprocessingml/2006/main" w:ilvl="5">
+      <w:start w:val="1"/>
+      <w:numFmt w:val="bullet"/>
+      <w:lvlText w:val=""/>
+      <w:lvlJc w:val="left"/>
+      <w:pPr>
+        <w:ind w:left="4320" w:hanging="360"/>
+      </w:pPr>
+      <w:rPr>
+        <w:rFonts w:hint="default" w:ascii="Wingdings" w:hAnsi="Wingdings"/>
+      </w:rPr>
+    </w:lvl>
+    <w:lvl xmlns:w="http://schemas.openxmlformats.org/wordprocessingml/2006/main" w:ilvl="6">
+      <w:start w:val="1"/>
+      <w:numFmt w:val="bullet"/>
+      <w:lvlText w:val=""/>
+      <w:lvlJc w:val="left"/>
+      <w:pPr>
+        <w:ind w:left="5040" w:hanging="360"/>
+      </w:pPr>
+      <w:rPr>
+        <w:rFonts w:hint="default" w:ascii="Symbol" w:hAnsi="Symbol"/>
+      </w:rPr>
+    </w:lvl>
+    <w:lvl xmlns:w="http://schemas.openxmlformats.org/wordprocessingml/2006/main" w:ilvl="7">
+      <w:start w:val="1"/>
+      <w:numFmt w:val="bullet"/>
+      <w:lvlText w:val="o"/>
+      <w:lvlJc w:val="left"/>
+      <w:pPr>
+        <w:ind w:left="5760" w:hanging="360"/>
+      </w:pPr>
+      <w:rPr>
+        <w:rFonts w:hint="default" w:ascii="Courier New" w:hAnsi="Courier New"/>
+      </w:rPr>
+    </w:lvl>
+    <w:lvl xmlns:w="http://schemas.openxmlformats.org/wordprocessingml/2006/main" w:ilvl="8">
+      <w:start w:val="1"/>
+      <w:numFmt w:val="bullet"/>
+      <w:lvlText w:val=""/>
+      <w:lvlJc w:val="left"/>
+      <w:pPr>
+        <w:ind w:left="6480" w:hanging="360"/>
+      </w:pPr>
+      <w:rPr>
+        <w:rFonts w:hint="default" w:ascii="Wingdings" w:hAnsi="Wingdings"/>
+      </w:rPr>
+    </w:lvl>
+  </w:abstractNum>
+  <w:abstractNum xmlns:w="http://schemas.openxmlformats.org/wordprocessingml/2006/main" w:abstractNumId="30">
+    <w:nsid w:val="3e023518"/>
+    <w:multiLevelType xmlns:w="http://schemas.openxmlformats.org/wordprocessingml/2006/main" w:val="hybridMultilevel"/>
+    <w:lvl xmlns:w="http://schemas.openxmlformats.org/wordprocessingml/2006/main" w:ilvl="0">
+      <w:start w:val="1"/>
+      <w:numFmt w:val="bullet"/>
+      <w:lvlText w:val=""/>
+      <w:lvlJc w:val="left"/>
+      <w:pPr>
+        <w:ind w:left="720" w:hanging="360"/>
+      </w:pPr>
+      <w:rPr>
+        <w:rFonts w:hint="default" w:ascii="Symbol" w:hAnsi="Symbol"/>
+      </w:rPr>
+    </w:lvl>
+    <w:lvl xmlns:w="http://schemas.openxmlformats.org/wordprocessingml/2006/main" w:ilvl="1">
+      <w:start w:val="1"/>
+      <w:numFmt w:val="bullet"/>
+      <w:lvlText w:val="o"/>
+      <w:lvlJc w:val="left"/>
+      <w:pPr>
+        <w:ind w:left="1440" w:hanging="360"/>
+      </w:pPr>
+      <w:rPr>
+        <w:rFonts w:hint="default" w:ascii="Courier New" w:hAnsi="Courier New"/>
+      </w:rPr>
+    </w:lvl>
+    <w:lvl xmlns:w="http://schemas.openxmlformats.org/wordprocessingml/2006/main" w:ilvl="2">
+      <w:start w:val="1"/>
+      <w:numFmt w:val="bullet"/>
+      <w:lvlText w:val=""/>
+      <w:lvlJc w:val="left"/>
+      <w:pPr>
+        <w:ind w:left="2160" w:hanging="360"/>
+      </w:pPr>
+      <w:rPr>
+        <w:rFonts w:hint="default" w:ascii="Wingdings" w:hAnsi="Wingdings"/>
+      </w:rPr>
+    </w:lvl>
+    <w:lvl xmlns:w="http://schemas.openxmlformats.org/wordprocessingml/2006/main" w:ilvl="3">
+      <w:start w:val="1"/>
+      <w:numFmt w:val="bullet"/>
+      <w:lvlText w:val=""/>
+      <w:lvlJc w:val="left"/>
+      <w:pPr>
+        <w:ind w:left="2880" w:hanging="360"/>
+      </w:pPr>
+      <w:rPr>
+        <w:rFonts w:hint="default" w:ascii="Symbol" w:hAnsi="Symbol"/>
+      </w:rPr>
+    </w:lvl>
+    <w:lvl xmlns:w="http://schemas.openxmlformats.org/wordprocessingml/2006/main" w:ilvl="4">
+      <w:start w:val="1"/>
+      <w:numFmt w:val="bullet"/>
+      <w:lvlText w:val="o"/>
+      <w:lvlJc w:val="left"/>
+      <w:pPr>
+        <w:ind w:left="3600" w:hanging="360"/>
+      </w:pPr>
+      <w:rPr>
+        <w:rFonts w:hint="default" w:ascii="Courier New" w:hAnsi="Courier New"/>
+      </w:rPr>
+    </w:lvl>
+    <w:lvl xmlns:w="http://schemas.openxmlformats.org/wordprocessingml/2006/main" w:ilvl="5">
+      <w:start w:val="1"/>
+      <w:numFmt w:val="bullet"/>
+      <w:lvlText w:val=""/>
+      <w:lvlJc w:val="left"/>
+      <w:pPr>
+        <w:ind w:left="4320" w:hanging="360"/>
+      </w:pPr>
+      <w:rPr>
+        <w:rFonts w:hint="default" w:ascii="Wingdings" w:hAnsi="Wingdings"/>
+      </w:rPr>
+    </w:lvl>
+    <w:lvl xmlns:w="http://schemas.openxmlformats.org/wordprocessingml/2006/main" w:ilvl="6">
+      <w:start w:val="1"/>
+      <w:numFmt w:val="bullet"/>
+      <w:lvlText w:val=""/>
+      <w:lvlJc w:val="left"/>
+      <w:pPr>
+        <w:ind w:left="5040" w:hanging="360"/>
+      </w:pPr>
+      <w:rPr>
+        <w:rFonts w:hint="default" w:ascii="Symbol" w:hAnsi="Symbol"/>
+      </w:rPr>
+    </w:lvl>
+    <w:lvl xmlns:w="http://schemas.openxmlformats.org/wordprocessingml/2006/main" w:ilvl="7">
+      <w:start w:val="1"/>
+      <w:numFmt w:val="bullet"/>
+      <w:lvlText w:val="o"/>
+      <w:lvlJc w:val="left"/>
+      <w:pPr>
+        <w:ind w:left="5760" w:hanging="360"/>
+      </w:pPr>
+      <w:rPr>
+        <w:rFonts w:hint="default" w:ascii="Courier New" w:hAnsi="Courier New"/>
+      </w:rPr>
+    </w:lvl>
+    <w:lvl xmlns:w="http://schemas.openxmlformats.org/wordprocessingml/2006/main" w:ilvl="8">
+      <w:start w:val="1"/>
+      <w:numFmt w:val="bullet"/>
+      <w:lvlText w:val=""/>
+      <w:lvlJc w:val="left"/>
+      <w:pPr>
+        <w:ind w:left="6480" w:hanging="360"/>
+      </w:pPr>
+      <w:rPr>
+        <w:rFonts w:hint="default" w:ascii="Wingdings" w:hAnsi="Wingdings"/>
+      </w:rPr>
+    </w:lvl>
+  </w:abstractNum>
+  <w:abstractNum xmlns:w="http://schemas.openxmlformats.org/wordprocessingml/2006/main" w:abstractNumId="29">
+    <w:nsid w:val="248bb8d8"/>
+    <w:multiLevelType xmlns:w="http://schemas.openxmlformats.org/wordprocessingml/2006/main" w:val="hybridMultilevel"/>
+    <w:lvl xmlns:w="http://schemas.openxmlformats.org/wordprocessingml/2006/main" w:ilvl="0">
+      <w:start w:val="1"/>
+      <w:numFmt w:val="bullet"/>
+      <w:lvlText w:val=""/>
+      <w:lvlJc w:val="left"/>
+      <w:pPr>
+        <w:ind w:left="720" w:hanging="360"/>
+      </w:pPr>
+      <w:rPr>
+        <w:rFonts w:hint="default" w:ascii="Symbol" w:hAnsi="Symbol"/>
+      </w:rPr>
+    </w:lvl>
+    <w:lvl xmlns:w="http://schemas.openxmlformats.org/wordprocessingml/2006/main" w:ilvl="1">
+      <w:start w:val="1"/>
+      <w:numFmt w:val="bullet"/>
+      <w:lvlText w:val="o"/>
+      <w:lvlJc w:val="left"/>
+      <w:pPr>
+        <w:ind w:left="1440" w:hanging="360"/>
+      </w:pPr>
+      <w:rPr>
+        <w:rFonts w:hint="default" w:ascii="Courier New" w:hAnsi="Courier New"/>
+      </w:rPr>
+    </w:lvl>
+    <w:lvl xmlns:w="http://schemas.openxmlformats.org/wordprocessingml/2006/main" w:ilvl="2">
+      <w:start w:val="1"/>
+      <w:numFmt w:val="bullet"/>
+      <w:lvlText w:val=""/>
+      <w:lvlJc w:val="left"/>
+      <w:pPr>
+        <w:ind w:left="2160" w:hanging="360"/>
+      </w:pPr>
+      <w:rPr>
+        <w:rFonts w:hint="default" w:ascii="Wingdings" w:hAnsi="Wingdings"/>
+      </w:rPr>
+    </w:lvl>
+    <w:lvl xmlns:w="http://schemas.openxmlformats.org/wordprocessingml/2006/main" w:ilvl="3">
+      <w:start w:val="1"/>
+      <w:numFmt w:val="bullet"/>
+      <w:lvlText w:val=""/>
+      <w:lvlJc w:val="left"/>
+      <w:pPr>
+        <w:ind w:left="2880" w:hanging="360"/>
+      </w:pPr>
+      <w:rPr>
+        <w:rFonts w:hint="default" w:ascii="Symbol" w:hAnsi="Symbol"/>
+      </w:rPr>
+    </w:lvl>
+    <w:lvl xmlns:w="http://schemas.openxmlformats.org/wordprocessingml/2006/main" w:ilvl="4">
+      <w:start w:val="1"/>
+      <w:numFmt w:val="bullet"/>
+      <w:lvlText w:val="o"/>
+      <w:lvlJc w:val="left"/>
+      <w:pPr>
+        <w:ind w:left="3600" w:hanging="360"/>
+      </w:pPr>
+      <w:rPr>
+        <w:rFonts w:hint="default" w:ascii="Courier New" w:hAnsi="Courier New"/>
+      </w:rPr>
+    </w:lvl>
+    <w:lvl xmlns:w="http://schemas.openxmlformats.org/wordprocessingml/2006/main" w:ilvl="5">
+      <w:start w:val="1"/>
+      <w:numFmt w:val="bullet"/>
+      <w:lvlText w:val=""/>
+      <w:lvlJc w:val="left"/>
+      <w:pPr>
+        <w:ind w:left="4320" w:hanging="360"/>
+      </w:pPr>
+      <w:rPr>
+        <w:rFonts w:hint="default" w:ascii="Wingdings" w:hAnsi="Wingdings"/>
+      </w:rPr>
+    </w:lvl>
+    <w:lvl xmlns:w="http://schemas.openxmlformats.org/wordprocessingml/2006/main" w:ilvl="6">
+      <w:start w:val="1"/>
+      <w:numFmt w:val="bullet"/>
+      <w:lvlText w:val=""/>
+      <w:lvlJc w:val="left"/>
+      <w:pPr>
+        <w:ind w:left="5040" w:hanging="360"/>
+      </w:pPr>
+      <w:rPr>
+        <w:rFonts w:hint="default" w:ascii="Symbol" w:hAnsi="Symbol"/>
+      </w:rPr>
+    </w:lvl>
+    <w:lvl xmlns:w="http://schemas.openxmlformats.org/wordprocessingml/2006/main" w:ilvl="7">
+      <w:start w:val="1"/>
+      <w:numFmt w:val="bullet"/>
+      <w:lvlText w:val="o"/>
+      <w:lvlJc w:val="left"/>
+      <w:pPr>
+        <w:ind w:left="5760" w:hanging="360"/>
+      </w:pPr>
+      <w:rPr>
+        <w:rFonts w:hint="default" w:ascii="Courier New" w:hAnsi="Courier New"/>
+      </w:rPr>
+    </w:lvl>
+    <w:lvl xmlns:w="http://schemas.openxmlformats.org/wordprocessingml/2006/main" w:ilvl="8">
+      <w:start w:val="1"/>
+      <w:numFmt w:val="bullet"/>
+      <w:lvlText w:val=""/>
+      <w:lvlJc w:val="left"/>
+      <w:pPr>
+        <w:ind w:left="6480" w:hanging="360"/>
+      </w:pPr>
+      <w:rPr>
+        <w:rFonts w:hint="default" w:ascii="Wingdings" w:hAnsi="Wingdings"/>
+      </w:rPr>
+    </w:lvl>
+  </w:abstractNum>
+  <w:abstractNum xmlns:w="http://schemas.openxmlformats.org/wordprocessingml/2006/main" w:abstractNumId="28">
+    <w:nsid w:val="5e96396b"/>
+    <w:multiLevelType xmlns:w="http://schemas.openxmlformats.org/wordprocessingml/2006/main" w:val="hybridMultilevel"/>
+    <w:lvl xmlns:w="http://schemas.openxmlformats.org/wordprocessingml/2006/main" w:ilvl="0">
+      <w:start w:val="1"/>
+      <w:numFmt w:val="bullet"/>
+      <w:lvlText w:val=""/>
+      <w:lvlJc w:val="left"/>
+      <w:pPr>
+        <w:ind w:left="720" w:hanging="360"/>
+      </w:pPr>
+      <w:rPr>
+        <w:rFonts w:hint="default" w:ascii="Symbol" w:hAnsi="Symbol"/>
+      </w:rPr>
+    </w:lvl>
+    <w:lvl xmlns:w="http://schemas.openxmlformats.org/wordprocessingml/2006/main" w:ilvl="1">
+      <w:start w:val="1"/>
+      <w:numFmt w:val="bullet"/>
+      <w:lvlText w:val="o"/>
+      <w:lvlJc w:val="left"/>
+      <w:pPr>
+        <w:ind w:left="1440" w:hanging="360"/>
+      </w:pPr>
+      <w:rPr>
+        <w:rFonts w:hint="default" w:ascii="Courier New" w:hAnsi="Courier New"/>
+      </w:rPr>
+    </w:lvl>
+    <w:lvl xmlns:w="http://schemas.openxmlformats.org/wordprocessingml/2006/main" w:ilvl="2">
+      <w:start w:val="1"/>
+      <w:numFmt w:val="bullet"/>
+      <w:lvlText w:val=""/>
+      <w:lvlJc w:val="left"/>
+      <w:pPr>
+        <w:ind w:left="2160" w:hanging="360"/>
+      </w:pPr>
+      <w:rPr>
+        <w:rFonts w:hint="default" w:ascii="Wingdings" w:hAnsi="Wingdings"/>
+      </w:rPr>
+    </w:lvl>
+    <w:lvl xmlns:w="http://schemas.openxmlformats.org/wordprocessingml/2006/main" w:ilvl="3">
+      <w:start w:val="1"/>
+      <w:numFmt w:val="bullet"/>
+      <w:lvlText w:val=""/>
+      <w:lvlJc w:val="left"/>
+      <w:pPr>
+        <w:ind w:left="2880" w:hanging="360"/>
+      </w:pPr>
+      <w:rPr>
+        <w:rFonts w:hint="default" w:ascii="Symbol" w:hAnsi="Symbol"/>
+      </w:rPr>
+    </w:lvl>
+    <w:lvl xmlns:w="http://schemas.openxmlformats.org/wordprocessingml/2006/main" w:ilvl="4">
+      <w:start w:val="1"/>
+      <w:numFmt w:val="bullet"/>
+      <w:lvlText w:val="o"/>
+      <w:lvlJc w:val="left"/>
+      <w:pPr>
+        <w:ind w:left="3600" w:hanging="360"/>
+      </w:pPr>
+      <w:rPr>
+        <w:rFonts w:hint="default" w:ascii="Courier New" w:hAnsi="Courier New"/>
+      </w:rPr>
+    </w:lvl>
+    <w:lvl xmlns:w="http://schemas.openxmlformats.org/wordprocessingml/2006/main" w:ilvl="5">
+      <w:start w:val="1"/>
+      <w:numFmt w:val="bullet"/>
+      <w:lvlText w:val=""/>
+      <w:lvlJc w:val="left"/>
+      <w:pPr>
+        <w:ind w:left="4320" w:hanging="360"/>
+      </w:pPr>
+      <w:rPr>
+        <w:rFonts w:hint="default" w:ascii="Wingdings" w:hAnsi="Wingdings"/>
+      </w:rPr>
+    </w:lvl>
+    <w:lvl xmlns:w="http://schemas.openxmlformats.org/wordprocessingml/2006/main" w:ilvl="6">
+      <w:start w:val="1"/>
+      <w:numFmt w:val="bullet"/>
+      <w:lvlText w:val=""/>
+      <w:lvlJc w:val="left"/>
+      <w:pPr>
+        <w:ind w:left="5040" w:hanging="360"/>
+      </w:pPr>
+      <w:rPr>
+        <w:rFonts w:hint="default" w:ascii="Symbol" w:hAnsi="Symbol"/>
+      </w:rPr>
+    </w:lvl>
+    <w:lvl xmlns:w="http://schemas.openxmlformats.org/wordprocessingml/2006/main" w:ilvl="7">
+      <w:start w:val="1"/>
+      <w:numFmt w:val="bullet"/>
+      <w:lvlText w:val="o"/>
+      <w:lvlJc w:val="left"/>
+      <w:pPr>
+        <w:ind w:left="5760" w:hanging="360"/>
+      </w:pPr>
+      <w:rPr>
+        <w:rFonts w:hint="default" w:ascii="Courier New" w:hAnsi="Courier New"/>
+      </w:rPr>
+    </w:lvl>
+    <w:lvl xmlns:w="http://schemas.openxmlformats.org/wordprocessingml/2006/main" w:ilvl="8">
+      <w:start w:val="1"/>
+      <w:numFmt w:val="bullet"/>
+      <w:lvlText w:val=""/>
+      <w:lvlJc w:val="left"/>
+      <w:pPr>
+        <w:ind w:left="6480" w:hanging="360"/>
+      </w:pPr>
+      <w:rPr>
+        <w:rFonts w:hint="default" w:ascii="Wingdings" w:hAnsi="Wingdings"/>
+      </w:rPr>
+    </w:lvl>
+  </w:abstractNum>
+  <w:abstractNum xmlns:w="http://schemas.openxmlformats.org/wordprocessingml/2006/main" w:abstractNumId="27">
+    <w:nsid w:val="137983d1"/>
+    <w:multiLevelType xmlns:w="http://schemas.openxmlformats.org/wordprocessingml/2006/main" w:val="hybridMultilevel"/>
+    <w:lvl xmlns:w="http://schemas.openxmlformats.org/wordprocessingml/2006/main" w:ilvl="0">
+      <w:start w:val="1"/>
+      <w:numFmt w:val="bullet"/>
+      <w:lvlText w:val=""/>
+      <w:lvlJc w:val="left"/>
+      <w:pPr>
+        <w:ind w:left="720" w:hanging="360"/>
+      </w:pPr>
+      <w:rPr>
+        <w:rFonts w:hint="default" w:ascii="Wingdings" w:hAnsi="Wingdings"/>
+      </w:rPr>
+    </w:lvl>
+    <w:lvl xmlns:w="http://schemas.openxmlformats.org/wordprocessingml/2006/main" w:ilvl="1">
+      <w:start w:val="1"/>
+      <w:numFmt w:val="bullet"/>
+      <w:lvlText w:val="o"/>
+      <w:lvlJc w:val="left"/>
+      <w:pPr>
+        <w:ind w:left="1440" w:hanging="360"/>
+      </w:pPr>
+      <w:rPr>
+        <w:rFonts w:hint="default" w:ascii="Courier New" w:hAnsi="Courier New"/>
+      </w:rPr>
+    </w:lvl>
+    <w:lvl xmlns:w="http://schemas.openxmlformats.org/wordprocessingml/2006/main" w:ilvl="2">
+      <w:start w:val="1"/>
+      <w:numFmt w:val="bullet"/>
+      <w:lvlText w:val=""/>
+      <w:lvlJc w:val="left"/>
+      <w:pPr>
+        <w:ind w:left="2160" w:hanging="360"/>
+      </w:pPr>
+      <w:rPr>
+        <w:rFonts w:hint="default" w:ascii="Wingdings" w:hAnsi="Wingdings"/>
+      </w:rPr>
+    </w:lvl>
+    <w:lvl xmlns:w="http://schemas.openxmlformats.org/wordprocessingml/2006/main" w:ilvl="3">
+      <w:start w:val="1"/>
+      <w:numFmt w:val="bullet"/>
+      <w:lvlText w:val=""/>
+      <w:lvlJc w:val="left"/>
+      <w:pPr>
+        <w:ind w:left="2880" w:hanging="360"/>
+      </w:pPr>
+      <w:rPr>
+        <w:rFonts w:hint="default" w:ascii="Symbol" w:hAnsi="Symbol"/>
+      </w:rPr>
+    </w:lvl>
+    <w:lvl xmlns:w="http://schemas.openxmlformats.org/wordprocessingml/2006/main" w:ilvl="4">
+      <w:start w:val="1"/>
+      <w:numFmt w:val="bullet"/>
+      <w:lvlText w:val="o"/>
+      <w:lvlJc w:val="left"/>
+      <w:pPr>
+        <w:ind w:left="3600" w:hanging="360"/>
+      </w:pPr>
+      <w:rPr>
+        <w:rFonts w:hint="default" w:ascii="Courier New" w:hAnsi="Courier New"/>
+      </w:rPr>
+    </w:lvl>
+    <w:lvl xmlns:w="http://schemas.openxmlformats.org/wordprocessingml/2006/main" w:ilvl="5">
+      <w:start w:val="1"/>
+      <w:numFmt w:val="bullet"/>
+      <w:lvlText w:val=""/>
+      <w:lvlJc w:val="left"/>
+      <w:pPr>
+        <w:ind w:left="4320" w:hanging="360"/>
+      </w:pPr>
+      <w:rPr>
+        <w:rFonts w:hint="default" w:ascii="Wingdings" w:hAnsi="Wingdings"/>
+      </w:rPr>
+    </w:lvl>
+    <w:lvl xmlns:w="http://schemas.openxmlformats.org/wordprocessingml/2006/main" w:ilvl="6">
+      <w:start w:val="1"/>
+      <w:numFmt w:val="bullet"/>
+      <w:lvlText w:val=""/>
+      <w:lvlJc w:val="left"/>
+      <w:pPr>
+        <w:ind w:left="5040" w:hanging="360"/>
+      </w:pPr>
+      <w:rPr>
+        <w:rFonts w:hint="default" w:ascii="Symbol" w:hAnsi="Symbol"/>
+      </w:rPr>
+    </w:lvl>
+    <w:lvl xmlns:w="http://schemas.openxmlformats.org/wordprocessingml/2006/main" w:ilvl="7">
+      <w:start w:val="1"/>
+      <w:numFmt w:val="bullet"/>
+      <w:lvlText w:val="o"/>
+      <w:lvlJc w:val="left"/>
+      <w:pPr>
+        <w:ind w:left="5760" w:hanging="360"/>
+      </w:pPr>
+      <w:rPr>
+        <w:rFonts w:hint="default" w:ascii="Courier New" w:hAnsi="Courier New"/>
+      </w:rPr>
+    </w:lvl>
+    <w:lvl xmlns:w="http://schemas.openxmlformats.org/wordprocessingml/2006/main" w:ilvl="8">
+      <w:start w:val="1"/>
+      <w:numFmt w:val="bullet"/>
+      <w:lvlText w:val=""/>
+      <w:lvlJc w:val="left"/>
+      <w:pPr>
+        <w:ind w:left="6480" w:hanging="360"/>
+      </w:pPr>
+      <w:rPr>
+        <w:rFonts w:hint="default" w:ascii="Wingdings" w:hAnsi="Wingdings"/>
+      </w:rPr>
+    </w:lvl>
+  </w:abstractNum>
+  <w:abstractNum xmlns:w="http://schemas.openxmlformats.org/wordprocessingml/2006/main" w:abstractNumId="26">
+    <w:nsid w:val="344ab9e9"/>
+    <w:multiLevelType xmlns:w="http://schemas.openxmlformats.org/wordprocessingml/2006/main" w:val="hybridMultilevel"/>
+    <w:lvl xmlns:w="http://schemas.openxmlformats.org/wordprocessingml/2006/main" w:ilvl="0">
+      <w:start w:val="1"/>
+      <w:numFmt w:val="bullet"/>
+      <w:lvlText w:val=""/>
+      <w:lvlJc w:val="left"/>
+      <w:pPr>
+        <w:ind w:left="720" w:hanging="360"/>
+      </w:pPr>
+      <w:rPr>
+        <w:rFonts w:hint="default" w:ascii="Symbol" w:hAnsi="Symbol"/>
+      </w:rPr>
+    </w:lvl>
+    <w:lvl xmlns:w="http://schemas.openxmlformats.org/wordprocessingml/2006/main" w:ilvl="1">
+      <w:start w:val="1"/>
+      <w:numFmt w:val="bullet"/>
+      <w:lvlText w:val="o"/>
+      <w:lvlJc w:val="left"/>
+      <w:pPr>
+        <w:ind w:left="1440" w:hanging="360"/>
+      </w:pPr>
+      <w:rPr>
+        <w:rFonts w:hint="default" w:ascii="Courier New" w:hAnsi="Courier New"/>
+      </w:rPr>
+    </w:lvl>
+    <w:lvl xmlns:w="http://schemas.openxmlformats.org/wordprocessingml/2006/main" w:ilvl="2">
+      <w:start w:val="1"/>
+      <w:numFmt w:val="bullet"/>
+      <w:lvlText w:val=""/>
+      <w:lvlJc w:val="left"/>
+      <w:pPr>
+        <w:ind w:left="2160" w:hanging="360"/>
+      </w:pPr>
+      <w:rPr>
+        <w:rFonts w:hint="default" w:ascii="Wingdings" w:hAnsi="Wingdings"/>
+      </w:rPr>
+    </w:lvl>
+    <w:lvl xmlns:w="http://schemas.openxmlformats.org/wordprocessingml/2006/main" w:ilvl="3">
+      <w:start w:val="1"/>
+      <w:numFmt w:val="bullet"/>
+      <w:lvlText w:val=""/>
+      <w:lvlJc w:val="left"/>
+      <w:pPr>
+        <w:ind w:left="2880" w:hanging="360"/>
+      </w:pPr>
+      <w:rPr>
+        <w:rFonts w:hint="default" w:ascii="Symbol" w:hAnsi="Symbol"/>
+      </w:rPr>
+    </w:lvl>
+    <w:lvl xmlns:w="http://schemas.openxmlformats.org/wordprocessingml/2006/main" w:ilvl="4">
+      <w:start w:val="1"/>
+      <w:numFmt w:val="bullet"/>
+      <w:lvlText w:val="o"/>
+      <w:lvlJc w:val="left"/>
+      <w:pPr>
+        <w:ind w:left="3600" w:hanging="360"/>
+      </w:pPr>
+      <w:rPr>
+        <w:rFonts w:hint="default" w:ascii="Courier New" w:hAnsi="Courier New"/>
+      </w:rPr>
+    </w:lvl>
+    <w:lvl xmlns:w="http://schemas.openxmlformats.org/wordprocessingml/2006/main" w:ilvl="5">
+      <w:start w:val="1"/>
+      <w:numFmt w:val="bullet"/>
+      <w:lvlText w:val=""/>
+      <w:lvlJc w:val="left"/>
+      <w:pPr>
+        <w:ind w:left="4320" w:hanging="360"/>
+      </w:pPr>
+      <w:rPr>
+        <w:rFonts w:hint="default" w:ascii="Wingdings" w:hAnsi="Wingdings"/>
+      </w:rPr>
+    </w:lvl>
+    <w:lvl xmlns:w="http://schemas.openxmlformats.org/wordprocessingml/2006/main" w:ilvl="6">
+      <w:start w:val="1"/>
+      <w:numFmt w:val="bullet"/>
+      <w:lvlText w:val=""/>
+      <w:lvlJc w:val="left"/>
+      <w:pPr>
+        <w:ind w:left="5040" w:hanging="360"/>
+      </w:pPr>
+      <w:rPr>
+        <w:rFonts w:hint="default" w:ascii="Symbol" w:hAnsi="Symbol"/>
+      </w:rPr>
+    </w:lvl>
+    <w:lvl xmlns:w="http://schemas.openxmlformats.org/wordprocessingml/2006/main" w:ilvl="7">
+      <w:start w:val="1"/>
+      <w:numFmt w:val="bullet"/>
+      <w:lvlText w:val="o"/>
+      <w:lvlJc w:val="left"/>
+      <w:pPr>
+        <w:ind w:left="5760" w:hanging="360"/>
+      </w:pPr>
+      <w:rPr>
+        <w:rFonts w:hint="default" w:ascii="Courier New" w:hAnsi="Courier New"/>
+      </w:rPr>
+    </w:lvl>
+    <w:lvl xmlns:w="http://schemas.openxmlformats.org/wordprocessingml/2006/main" w:ilvl="8">
+      <w:start w:val="1"/>
+      <w:numFmt w:val="bullet"/>
+      <w:lvlText w:val=""/>
+      <w:lvlJc w:val="left"/>
+      <w:pPr>
+        <w:ind w:left="6480" w:hanging="360"/>
+      </w:pPr>
+      <w:rPr>
+        <w:rFonts w:hint="default" w:ascii="Wingdings" w:hAnsi="Wingdings"/>
+      </w:rPr>
+    </w:lvl>
+  </w:abstractNum>
+  <w:abstractNum xmlns:w="http://schemas.openxmlformats.org/wordprocessingml/2006/main" w:abstractNumId="25">
+    <w:nsid w:val="38dc6246"/>
+    <w:multiLevelType xmlns:w="http://schemas.openxmlformats.org/wordprocessingml/2006/main" w:val="hybridMultilevel"/>
+    <w:lvl xmlns:w="http://schemas.openxmlformats.org/wordprocessingml/2006/main" w:ilvl="0">
+      <w:start w:val="1"/>
+      <w:numFmt w:val="decimal"/>
+      <w:lvlText w:val="%1."/>
+      <w:lvlJc w:val="left"/>
+      <w:pPr>
+        <w:ind w:left="720" w:hanging="360"/>
+      </w:pPr>
+    </w:lvl>
+    <w:lvl xmlns:w="http://schemas.openxmlformats.org/wordprocessingml/2006/main" w:ilvl="1">
+      <w:start w:val="1"/>
+      <w:numFmt w:val="lowerLetter"/>
+      <w:lvlText w:val="%2."/>
+      <w:lvlJc w:val="left"/>
+      <w:pPr>
+        <w:ind w:left="1440" w:hanging="360"/>
+      </w:pPr>
+    </w:lvl>
+    <w:lvl xmlns:w="http://schemas.openxmlformats.org/wordprocessingml/2006/main" w:ilvl="2">
+      <w:start w:val="1"/>
+      <w:numFmt w:val="lowerRoman"/>
+      <w:lvlText w:val="%3."/>
+      <w:lvlJc w:val="right"/>
+      <w:pPr>
+        <w:ind w:left="2160" w:hanging="180"/>
+      </w:pPr>
+    </w:lvl>
+    <w:lvl xmlns:w="http://schemas.openxmlformats.org/wordprocessingml/2006/main" w:ilvl="3">
+      <w:start w:val="1"/>
+      <w:numFmt w:val="decimal"/>
+      <w:lvlText w:val="%4."/>
+      <w:lvlJc w:val="left"/>
+      <w:pPr>
+        <w:ind w:left="2880" w:hanging="360"/>
+      </w:pPr>
+    </w:lvl>
+    <w:lvl xmlns:w="http://schemas.openxmlformats.org/wordprocessingml/2006/main" w:ilvl="4">
+      <w:start w:val="1"/>
+      <w:numFmt w:val="lowerLetter"/>
+      <w:lvlText w:val="%5."/>
+      <w:lvlJc w:val="left"/>
+      <w:pPr>
+        <w:ind w:left="3600" w:hanging="360"/>
+      </w:pPr>
+    </w:lvl>
+    <w:lvl xmlns:w="http://schemas.openxmlformats.org/wordprocessingml/2006/main" w:ilvl="5">
+      <w:start w:val="1"/>
+      <w:numFmt w:val="lowerRoman"/>
+      <w:lvlText w:val="%6."/>
+      <w:lvlJc w:val="right"/>
+      <w:pPr>
+        <w:ind w:left="4320" w:hanging="180"/>
+      </w:pPr>
+    </w:lvl>
+    <w:lvl xmlns:w="http://schemas.openxmlformats.org/wordprocessingml/2006/main" w:ilvl="6">
+      <w:start w:val="1"/>
+      <w:numFmt w:val="decimal"/>
+      <w:lvlText w:val="%7."/>
+      <w:lvlJc w:val="left"/>
+      <w:pPr>
+        <w:ind w:left="5040" w:hanging="360"/>
+      </w:pPr>
+    </w:lvl>
+    <w:lvl xmlns:w="http://schemas.openxmlformats.org/wordprocessingml/2006/main" w:ilvl="7">
+      <w:start w:val="1"/>
+      <w:numFmt w:val="lowerLetter"/>
+      <w:lvlText w:val="%8."/>
+      <w:lvlJc w:val="left"/>
+      <w:pPr>
+        <w:ind w:left="5760" w:hanging="360"/>
+      </w:pPr>
+    </w:lvl>
+    <w:lvl xmlns:w="http://schemas.openxmlformats.org/wordprocessingml/2006/main" w:ilvl="8">
+      <w:start w:val="1"/>
+      <w:numFmt w:val="lowerRoman"/>
+      <w:lvlText w:val="%9."/>
+      <w:lvlJc w:val="right"/>
+      <w:pPr>
+        <w:ind w:left="6480" w:hanging="180"/>
+      </w:pPr>
+    </w:lvl>
+  </w:abstractNum>
+  <w:abstractNum xmlns:w="http://schemas.openxmlformats.org/wordprocessingml/2006/main" w:abstractNumId="24">
+    <w:nsid w:val="3c268428"/>
+    <w:multiLevelType xmlns:w="http://schemas.openxmlformats.org/wordprocessingml/2006/main" w:val="hybridMultilevel"/>
+    <w:lvl xmlns:w="http://schemas.openxmlformats.org/wordprocessingml/2006/main" w:ilvl="0">
+      <w:start w:val="1"/>
+      <w:numFmt w:val="bullet"/>
+      <w:lvlText w:val=""/>
+      <w:lvlJc w:val="left"/>
+      <w:pPr>
+        <w:ind w:left="720" w:hanging="360"/>
+      </w:pPr>
+      <w:rPr>
+        <w:rFonts w:hint="default" w:ascii="Symbol" w:hAnsi="Symbol"/>
+      </w:rPr>
+    </w:lvl>
+    <w:lvl xmlns:w="http://schemas.openxmlformats.org/wordprocessingml/2006/main" w:ilvl="1">
+      <w:start w:val="1"/>
+      <w:numFmt w:val="bullet"/>
+      <w:lvlText w:val="o"/>
+      <w:lvlJc w:val="left"/>
+      <w:pPr>
+        <w:ind w:left="1440" w:hanging="360"/>
+      </w:pPr>
+      <w:rPr>
+        <w:rFonts w:hint="default" w:ascii="Courier New" w:hAnsi="Courier New"/>
+      </w:rPr>
+    </w:lvl>
+    <w:lvl xmlns:w="http://schemas.openxmlformats.org/wordprocessingml/2006/main" w:ilvl="2">
+      <w:start w:val="1"/>
+      <w:numFmt w:val="bullet"/>
+      <w:lvlText w:val=""/>
+      <w:lvlJc w:val="left"/>
+      <w:pPr>
+        <w:ind w:left="2160" w:hanging="360"/>
+      </w:pPr>
+      <w:rPr>
+        <w:rFonts w:hint="default" w:ascii="Wingdings" w:hAnsi="Wingdings"/>
+      </w:rPr>
+    </w:lvl>
+    <w:lvl xmlns:w="http://schemas.openxmlformats.org/wordprocessingml/2006/main" w:ilvl="3">
+      <w:start w:val="1"/>
+      <w:numFmt w:val="bullet"/>
+      <w:lvlText w:val=""/>
+      <w:lvlJc w:val="left"/>
+      <w:pPr>
+        <w:ind w:left="2880" w:hanging="360"/>
+      </w:pPr>
+      <w:rPr>
+        <w:rFonts w:hint="default" w:ascii="Symbol" w:hAnsi="Symbol"/>
+      </w:rPr>
+    </w:lvl>
+    <w:lvl xmlns:w="http://schemas.openxmlformats.org/wordprocessingml/2006/main" w:ilvl="4">
+      <w:start w:val="1"/>
+      <w:numFmt w:val="bullet"/>
+      <w:lvlText w:val="o"/>
+      <w:lvlJc w:val="left"/>
+      <w:pPr>
+        <w:ind w:left="3600" w:hanging="360"/>
+      </w:pPr>
+      <w:rPr>
+        <w:rFonts w:hint="default" w:ascii="Courier New" w:hAnsi="Courier New"/>
+      </w:rPr>
+    </w:lvl>
+    <w:lvl xmlns:w="http://schemas.openxmlformats.org/wordprocessingml/2006/main" w:ilvl="5">
+      <w:start w:val="1"/>
+      <w:numFmt w:val="bullet"/>
+      <w:lvlText w:val=""/>
+      <w:lvlJc w:val="left"/>
+      <w:pPr>
+        <w:ind w:left="4320" w:hanging="360"/>
+      </w:pPr>
+      <w:rPr>
+        <w:rFonts w:hint="default" w:ascii="Wingdings" w:hAnsi="Wingdings"/>
+      </w:rPr>
+    </w:lvl>
+    <w:lvl xmlns:w="http://schemas.openxmlformats.org/wordprocessingml/2006/main" w:ilvl="6">
+      <w:start w:val="1"/>
+      <w:numFmt w:val="bullet"/>
+      <w:lvlText w:val=""/>
+      <w:lvlJc w:val="left"/>
+      <w:pPr>
+        <w:ind w:left="5040" w:hanging="360"/>
+      </w:pPr>
+      <w:rPr>
+        <w:rFonts w:hint="default" w:ascii="Symbol" w:hAnsi="Symbol"/>
+      </w:rPr>
+    </w:lvl>
+    <w:lvl xmlns:w="http://schemas.openxmlformats.org/wordprocessingml/2006/main" w:ilvl="7">
+      <w:start w:val="1"/>
+      <w:numFmt w:val="bullet"/>
+      <w:lvlText w:val="o"/>
+      <w:lvlJc w:val="left"/>
+      <w:pPr>
+        <w:ind w:left="5760" w:hanging="360"/>
+      </w:pPr>
+      <w:rPr>
+        <w:rFonts w:hint="default" w:ascii="Courier New" w:hAnsi="Courier New"/>
+      </w:rPr>
+    </w:lvl>
+    <w:lvl xmlns:w="http://schemas.openxmlformats.org/wordprocessingml/2006/main" w:ilvl="8">
+      <w:start w:val="1"/>
+      <w:numFmt w:val="bullet"/>
+      <w:lvlText w:val=""/>
+      <w:lvlJc w:val="left"/>
+      <w:pPr>
+        <w:ind w:left="6480" w:hanging="360"/>
+      </w:pPr>
+      <w:rPr>
+        <w:rFonts w:hint="default" w:ascii="Wingdings" w:hAnsi="Wingdings"/>
+      </w:rPr>
+    </w:lvl>
+  </w:abstractNum>
+  <w:abstractNum xmlns:w="http://schemas.openxmlformats.org/wordprocessingml/2006/main" w:abstractNumId="23">
+    <w:nsid w:val="7a1649b0"/>
+    <w:multiLevelType xmlns:w="http://schemas.openxmlformats.org/wordprocessingml/2006/main" w:val="hybridMultilevel"/>
+    <w:lvl xmlns:w="http://schemas.openxmlformats.org/wordprocessingml/2006/main" w:ilvl="0">
+      <w:start w:val="1"/>
+      <w:numFmt w:val="bullet"/>
+      <w:lvlText w:val=""/>
+      <w:lvlJc w:val="left"/>
+      <w:pPr>
+        <w:ind w:left="720" w:hanging="360"/>
+      </w:pPr>
+      <w:rPr>
+        <w:rFonts w:hint="default" w:ascii="Symbol" w:hAnsi="Symbol"/>
+      </w:rPr>
+    </w:lvl>
+    <w:lvl xmlns:w="http://schemas.openxmlformats.org/wordprocessingml/2006/main" w:ilvl="1">
+      <w:start w:val="1"/>
+      <w:numFmt w:val="bullet"/>
+      <w:lvlText w:val="o"/>
+      <w:lvlJc w:val="left"/>
+      <w:pPr>
+        <w:ind w:left="1440" w:hanging="360"/>
+      </w:pPr>
+      <w:rPr>
+        <w:rFonts w:hint="default" w:ascii="Courier New" w:hAnsi="Courier New"/>
+      </w:rPr>
+    </w:lvl>
+    <w:lvl xmlns:w="http://schemas.openxmlformats.org/wordprocessingml/2006/main" w:ilvl="2">
+      <w:start w:val="1"/>
+      <w:numFmt w:val="bullet"/>
+      <w:lvlText w:val=""/>
+      <w:lvlJc w:val="left"/>
+      <w:pPr>
+        <w:ind w:left="2160" w:hanging="360"/>
+      </w:pPr>
+      <w:rPr>
+        <w:rFonts w:hint="default" w:ascii="Wingdings" w:hAnsi="Wingdings"/>
+      </w:rPr>
+    </w:lvl>
+    <w:lvl xmlns:w="http://schemas.openxmlformats.org/wordprocessingml/2006/main" w:ilvl="3">
+      <w:start w:val="1"/>
+      <w:numFmt w:val="bullet"/>
+      <w:lvlText w:val=""/>
+      <w:lvlJc w:val="left"/>
+      <w:pPr>
+        <w:ind w:left="2880" w:hanging="360"/>
+      </w:pPr>
+      <w:rPr>
+        <w:rFonts w:hint="default" w:ascii="Symbol" w:hAnsi="Symbol"/>
+      </w:rPr>
+    </w:lvl>
+    <w:lvl xmlns:w="http://schemas.openxmlformats.org/wordprocessingml/2006/main" w:ilvl="4">
+      <w:start w:val="1"/>
+      <w:numFmt w:val="bullet"/>
+      <w:lvlText w:val="o"/>
+      <w:lvlJc w:val="left"/>
+      <w:pPr>
+        <w:ind w:left="3600" w:hanging="360"/>
+      </w:pPr>
+      <w:rPr>
+        <w:rFonts w:hint="default" w:ascii="Courier New" w:hAnsi="Courier New"/>
+      </w:rPr>
+    </w:lvl>
+    <w:lvl xmlns:w="http://schemas.openxmlformats.org/wordprocessingml/2006/main" w:ilvl="5">
+      <w:start w:val="1"/>
+      <w:numFmt w:val="bullet"/>
+      <w:lvlText w:val=""/>
+      <w:lvlJc w:val="left"/>
+      <w:pPr>
+        <w:ind w:left="4320" w:hanging="360"/>
+      </w:pPr>
+      <w:rPr>
+        <w:rFonts w:hint="default" w:ascii="Wingdings" w:hAnsi="Wingdings"/>
+      </w:rPr>
+    </w:lvl>
+    <w:lvl xmlns:w="http://schemas.openxmlformats.org/wordprocessingml/2006/main" w:ilvl="6">
+      <w:start w:val="1"/>
+      <w:numFmt w:val="bullet"/>
+      <w:lvlText w:val=""/>
+      <w:lvlJc w:val="left"/>
+      <w:pPr>
+        <w:ind w:left="5040" w:hanging="360"/>
+      </w:pPr>
+      <w:rPr>
+        <w:rFonts w:hint="default" w:ascii="Symbol" w:hAnsi="Symbol"/>
+      </w:rPr>
+    </w:lvl>
+    <w:lvl xmlns:w="http://schemas.openxmlformats.org/wordprocessingml/2006/main" w:ilvl="7">
+      <w:start w:val="1"/>
+      <w:numFmt w:val="bullet"/>
+      <w:lvlText w:val="o"/>
+      <w:lvlJc w:val="left"/>
+      <w:pPr>
+        <w:ind w:left="5760" w:hanging="360"/>
+      </w:pPr>
+      <w:rPr>
+        <w:rFonts w:hint="default" w:ascii="Courier New" w:hAnsi="Courier New"/>
+      </w:rPr>
+    </w:lvl>
+    <w:lvl xmlns:w="http://schemas.openxmlformats.org/wordprocessingml/2006/main" w:ilvl="8">
+      <w:start w:val="1"/>
+      <w:numFmt w:val="bullet"/>
+      <w:lvlText w:val=""/>
+      <w:lvlJc w:val="left"/>
+      <w:pPr>
+        <w:ind w:left="6480" w:hanging="360"/>
+      </w:pPr>
+      <w:rPr>
+        <w:rFonts w:hint="default" w:ascii="Wingdings" w:hAnsi="Wingdings"/>
+      </w:rPr>
+    </w:lvl>
+  </w:abstractNum>
+  <w:abstractNum xmlns:w="http://schemas.openxmlformats.org/wordprocessingml/2006/main" w:abstractNumId="22">
+    <w:nsid w:val="89de1dc"/>
+    <w:multiLevelType xmlns:w="http://schemas.openxmlformats.org/wordprocessingml/2006/main" w:val="hybridMultilevel"/>
+    <w:lvl xmlns:w="http://schemas.openxmlformats.org/wordprocessingml/2006/main" w:ilvl="0">
+      <w:start w:val="1"/>
+      <w:numFmt w:val="bullet"/>
+      <w:lvlText w:val=""/>
+      <w:lvlJc w:val="left"/>
+      <w:pPr>
+        <w:ind w:left="720" w:hanging="360"/>
+      </w:pPr>
+      <w:rPr>
+        <w:rFonts w:hint="default" w:ascii="Symbol" w:hAnsi="Symbol"/>
+      </w:rPr>
+    </w:lvl>
+    <w:lvl xmlns:w="http://schemas.openxmlformats.org/wordprocessingml/2006/main" w:ilvl="1">
+      <w:start w:val="1"/>
+      <w:numFmt w:val="bullet"/>
+      <w:lvlText w:val="o"/>
+      <w:lvlJc w:val="left"/>
+      <w:pPr>
+        <w:ind w:left="1440" w:hanging="360"/>
+      </w:pPr>
+      <w:rPr>
+        <w:rFonts w:hint="default" w:ascii="Courier New" w:hAnsi="Courier New"/>
+      </w:rPr>
+    </w:lvl>
+    <w:lvl xmlns:w="http://schemas.openxmlformats.org/wordprocessingml/2006/main" w:ilvl="2">
+      <w:start w:val="1"/>
+      <w:numFmt w:val="bullet"/>
+      <w:lvlText w:val=""/>
+      <w:lvlJc w:val="left"/>
+      <w:pPr>
+        <w:ind w:left="2160" w:hanging="360"/>
+      </w:pPr>
+      <w:rPr>
+        <w:rFonts w:hint="default" w:ascii="Wingdings" w:hAnsi="Wingdings"/>
+      </w:rPr>
+    </w:lvl>
+    <w:lvl xmlns:w="http://schemas.openxmlformats.org/wordprocessingml/2006/main" w:ilvl="3">
+      <w:start w:val="1"/>
+      <w:numFmt w:val="bullet"/>
+      <w:lvlText w:val=""/>
+      <w:lvlJc w:val="left"/>
+      <w:pPr>
+        <w:ind w:left="2880" w:hanging="360"/>
+      </w:pPr>
+      <w:rPr>
+        <w:rFonts w:hint="default" w:ascii="Symbol" w:hAnsi="Symbol"/>
+      </w:rPr>
+    </w:lvl>
+    <w:lvl xmlns:w="http://schemas.openxmlformats.org/wordprocessingml/2006/main" w:ilvl="4">
+      <w:start w:val="1"/>
+      <w:numFmt w:val="bullet"/>
+      <w:lvlText w:val="o"/>
+      <w:lvlJc w:val="left"/>
+      <w:pPr>
+        <w:ind w:left="3600" w:hanging="360"/>
+      </w:pPr>
+      <w:rPr>
+        <w:rFonts w:hint="default" w:ascii="Courier New" w:hAnsi="Courier New"/>
+      </w:rPr>
+    </w:lvl>
+    <w:lvl xmlns:w="http://schemas.openxmlformats.org/wordprocessingml/2006/main" w:ilvl="5">
+      <w:start w:val="1"/>
+      <w:numFmt w:val="bullet"/>
+      <w:lvlText w:val=""/>
+      <w:lvlJc w:val="left"/>
+      <w:pPr>
+        <w:ind w:left="4320" w:hanging="360"/>
+      </w:pPr>
+      <w:rPr>
+        <w:rFonts w:hint="default" w:ascii="Wingdings" w:hAnsi="Wingdings"/>
+      </w:rPr>
+    </w:lvl>
+    <w:lvl xmlns:w="http://schemas.openxmlformats.org/wordprocessingml/2006/main" w:ilvl="6">
+      <w:start w:val="1"/>
+      <w:numFmt w:val="bullet"/>
+      <w:lvlText w:val=""/>
+      <w:lvlJc w:val="left"/>
+      <w:pPr>
+        <w:ind w:left="5040" w:hanging="360"/>
+      </w:pPr>
+      <w:rPr>
+        <w:rFonts w:hint="default" w:ascii="Symbol" w:hAnsi="Symbol"/>
+      </w:rPr>
+    </w:lvl>
+    <w:lvl xmlns:w="http://schemas.openxmlformats.org/wordprocessingml/2006/main" w:ilvl="7">
+      <w:start w:val="1"/>
+      <w:numFmt w:val="bullet"/>
+      <w:lvlText w:val="o"/>
+      <w:lvlJc w:val="left"/>
+      <w:pPr>
+        <w:ind w:left="5760" w:hanging="360"/>
+      </w:pPr>
+      <w:rPr>
+        <w:rFonts w:hint="default" w:ascii="Courier New" w:hAnsi="Courier New"/>
+      </w:rPr>
+    </w:lvl>
+    <w:lvl xmlns:w="http://schemas.openxmlformats.org/wordprocessingml/2006/main" w:ilvl="8">
+      <w:start w:val="1"/>
+      <w:numFmt w:val="bullet"/>
+      <w:lvlText w:val=""/>
+      <w:lvlJc w:val="left"/>
+      <w:pPr>
+        <w:ind w:left="6480" w:hanging="360"/>
+      </w:pPr>
+      <w:rPr>
+        <w:rFonts w:hint="default" w:ascii="Wingdings" w:hAnsi="Wingdings"/>
+      </w:rPr>
+    </w:lvl>
+  </w:abstractNum>
+  <w:abstractNum xmlns:w="http://schemas.openxmlformats.org/wordprocessingml/2006/main" w:abstractNumId="21">
+    <w:nsid w:val="1bed43e2"/>
+    <w:multiLevelType xmlns:w="http://schemas.openxmlformats.org/wordprocessingml/2006/main" w:val="hybridMultilevel"/>
+    <w:lvl xmlns:w="http://schemas.openxmlformats.org/wordprocessingml/2006/main" w:ilvl="0">
+      <w:start w:val="1"/>
+      <w:numFmt w:val="bullet"/>
+      <w:lvlText w:val=""/>
+      <w:lvlJc w:val="left"/>
+      <w:pPr>
+        <w:ind w:left="720" w:hanging="360"/>
+      </w:pPr>
+      <w:rPr>
+        <w:rFonts w:hint="default" w:ascii="Symbol" w:hAnsi="Symbol"/>
+      </w:rPr>
+    </w:lvl>
+    <w:lvl xmlns:w="http://schemas.openxmlformats.org/wordprocessingml/2006/main" w:ilvl="1">
+      <w:start w:val="1"/>
+      <w:numFmt w:val="bullet"/>
+      <w:lvlText w:val="o"/>
+      <w:lvlJc w:val="left"/>
+      <w:pPr>
+        <w:ind w:left="1440" w:hanging="360"/>
+      </w:pPr>
+      <w:rPr>
+        <w:rFonts w:hint="default" w:ascii="Courier New" w:hAnsi="Courier New"/>
+      </w:rPr>
+    </w:lvl>
+    <w:lvl xmlns:w="http://schemas.openxmlformats.org/wordprocessingml/2006/main" w:ilvl="2">
+      <w:start w:val="1"/>
+      <w:numFmt w:val="bullet"/>
+      <w:lvlText w:val=""/>
+      <w:lvlJc w:val="left"/>
+      <w:pPr>
+        <w:ind w:left="2160" w:hanging="360"/>
+      </w:pPr>
+      <w:rPr>
+        <w:rFonts w:hint="default" w:ascii="Wingdings" w:hAnsi="Wingdings"/>
+      </w:rPr>
+    </w:lvl>
+    <w:lvl xmlns:w="http://schemas.openxmlformats.org/wordprocessingml/2006/main" w:ilvl="3">
+      <w:start w:val="1"/>
+      <w:numFmt w:val="bullet"/>
+      <w:lvlText w:val=""/>
+      <w:lvlJc w:val="left"/>
+      <w:pPr>
+        <w:ind w:left="2880" w:hanging="360"/>
+      </w:pPr>
+      <w:rPr>
+        <w:rFonts w:hint="default" w:ascii="Symbol" w:hAnsi="Symbol"/>
+      </w:rPr>
+    </w:lvl>
+    <w:lvl xmlns:w="http://schemas.openxmlformats.org/wordprocessingml/2006/main" w:ilvl="4">
+      <w:start w:val="1"/>
+      <w:numFmt w:val="bullet"/>
+      <w:lvlText w:val="o"/>
+      <w:lvlJc w:val="left"/>
+      <w:pPr>
+        <w:ind w:left="3600" w:hanging="360"/>
+      </w:pPr>
+      <w:rPr>
+        <w:rFonts w:hint="default" w:ascii="Courier New" w:hAnsi="Courier New"/>
+      </w:rPr>
+    </w:lvl>
+    <w:lvl xmlns:w="http://schemas.openxmlformats.org/wordprocessingml/2006/main" w:ilvl="5">
+      <w:start w:val="1"/>
+      <w:numFmt w:val="bullet"/>
+      <w:lvlText w:val=""/>
+      <w:lvlJc w:val="left"/>
+      <w:pPr>
+        <w:ind w:left="4320" w:hanging="360"/>
+      </w:pPr>
+      <w:rPr>
+        <w:rFonts w:hint="default" w:ascii="Wingdings" w:hAnsi="Wingdings"/>
+      </w:rPr>
+    </w:lvl>
+    <w:lvl xmlns:w="http://schemas.openxmlformats.org/wordprocessingml/2006/main" w:ilvl="6">
+      <w:start w:val="1"/>
+      <w:numFmt w:val="bullet"/>
+      <w:lvlText w:val=""/>
+      <w:lvlJc w:val="left"/>
+      <w:pPr>
+        <w:ind w:left="5040" w:hanging="360"/>
+      </w:pPr>
+      <w:rPr>
+        <w:rFonts w:hint="default" w:ascii="Symbol" w:hAnsi="Symbol"/>
+      </w:rPr>
+    </w:lvl>
+    <w:lvl xmlns:w="http://schemas.openxmlformats.org/wordprocessingml/2006/main" w:ilvl="7">
+      <w:start w:val="1"/>
+      <w:numFmt w:val="bullet"/>
+      <w:lvlText w:val="o"/>
+      <w:lvlJc w:val="left"/>
+      <w:pPr>
+        <w:ind w:left="5760" w:hanging="360"/>
+      </w:pPr>
+      <w:rPr>
+        <w:rFonts w:hint="default" w:ascii="Courier New" w:hAnsi="Courier New"/>
+      </w:rPr>
+    </w:lvl>
+    <w:lvl xmlns:w="http://schemas.openxmlformats.org/wordprocessingml/2006/main" w:ilvl="8">
+      <w:start w:val="1"/>
+      <w:numFmt w:val="bullet"/>
+      <w:lvlText w:val=""/>
+      <w:lvlJc w:val="left"/>
+      <w:pPr>
+        <w:ind w:left="6480" w:hanging="360"/>
+      </w:pPr>
+      <w:rPr>
+        <w:rFonts w:hint="default" w:ascii="Wingdings" w:hAnsi="Wingdings"/>
+      </w:rPr>
+    </w:lvl>
+  </w:abstractNum>
+  <w:abstractNum xmlns:w="http://schemas.openxmlformats.org/wordprocessingml/2006/main" w:abstractNumId="20">
+    <w:nsid w:val="7b3d27c9"/>
+    <w:multiLevelType xmlns:w="http://schemas.openxmlformats.org/wordprocessingml/2006/main" w:val="hybridMultilevel"/>
+    <w:lvl xmlns:w="http://schemas.openxmlformats.org/wordprocessingml/2006/main" w:ilvl="0">
+      <w:start w:val="1"/>
+      <w:numFmt w:val="bullet"/>
+      <w:lvlText w:val=""/>
+      <w:lvlJc w:val="left"/>
+      <w:pPr>
+        <w:ind w:left="360" w:hanging="360"/>
+      </w:pPr>
+      <w:rPr>
+        <w:rFonts w:hint="default" w:ascii="Wingdings" w:hAnsi="Wingdings"/>
+      </w:rPr>
+    </w:lvl>
+    <w:lvl xmlns:w="http://schemas.openxmlformats.org/wordprocessingml/2006/main" w:ilvl="1">
+      <w:start w:val="1"/>
+      <w:numFmt w:val="bullet"/>
+      <w:lvlText w:val=""/>
+      <w:lvlJc w:val="left"/>
+      <w:pPr>
+        <w:ind w:left="1080" w:hanging="360"/>
+      </w:pPr>
+      <w:rPr>
+        <w:rFonts w:hint="default" w:ascii="Wingdings" w:hAnsi="Wingdings"/>
+      </w:rPr>
+    </w:lvl>
+    <w:lvl xmlns:w="http://schemas.openxmlformats.org/wordprocessingml/2006/main" w:ilvl="2">
+      <w:start w:val="1"/>
+      <w:numFmt w:val="bullet"/>
+      <w:lvlText w:val=""/>
+      <w:lvlJc w:val="left"/>
+      <w:pPr>
+        <w:ind w:left="1800" w:hanging="360"/>
+      </w:pPr>
+      <w:rPr>
+        <w:rFonts w:hint="default" w:ascii="Wingdings" w:hAnsi="Wingdings"/>
+      </w:rPr>
+    </w:lvl>
+    <w:lvl xmlns:w="http://schemas.openxmlformats.org/wordprocessingml/2006/main" w:ilvl="3">
+      <w:start w:val="1"/>
+      <w:numFmt w:val="bullet"/>
+      <w:lvlText w:val=""/>
+      <w:lvlJc w:val="left"/>
+      <w:pPr>
+        <w:ind w:left="2520" w:hanging="360"/>
+      </w:pPr>
+      <w:rPr>
+        <w:rFonts w:hint="default" w:ascii="Wingdings" w:hAnsi="Wingdings"/>
+      </w:rPr>
+    </w:lvl>
+    <w:lvl xmlns:w="http://schemas.openxmlformats.org/wordprocessingml/2006/main" w:ilvl="4">
+      <w:start w:val="1"/>
+      <w:numFmt w:val="bullet"/>
+      <w:lvlText w:val=""/>
+      <w:lvlJc w:val="left"/>
+      <w:pPr>
+        <w:ind w:left="3240" w:hanging="360"/>
+      </w:pPr>
+      <w:rPr>
+        <w:rFonts w:hint="default" w:ascii="Wingdings" w:hAnsi="Wingdings"/>
+      </w:rPr>
+    </w:lvl>
+    <w:lvl xmlns:w="http://schemas.openxmlformats.org/wordprocessingml/2006/main" w:ilvl="5">
+      <w:start w:val="1"/>
+      <w:numFmt w:val="bullet"/>
+      <w:lvlText w:val=""/>
+      <w:lvlJc w:val="left"/>
+      <w:pPr>
+        <w:ind w:left="3960" w:hanging="360"/>
+      </w:pPr>
+      <w:rPr>
+        <w:rFonts w:hint="default" w:ascii="Wingdings" w:hAnsi="Wingdings"/>
+      </w:rPr>
+    </w:lvl>
+    <w:lvl xmlns:w="http://schemas.openxmlformats.org/wordprocessingml/2006/main" w:ilvl="6">
+      <w:start w:val="1"/>
+      <w:numFmt w:val="bullet"/>
+      <w:lvlText w:val=""/>
+      <w:lvlJc w:val="left"/>
+      <w:pPr>
+        <w:ind w:left="4680" w:hanging="360"/>
+      </w:pPr>
+      <w:rPr>
+        <w:rFonts w:hint="default" w:ascii="Wingdings" w:hAnsi="Wingdings"/>
+      </w:rPr>
+    </w:lvl>
+    <w:lvl xmlns:w="http://schemas.openxmlformats.org/wordprocessingml/2006/main" w:ilvl="7">
+      <w:start w:val="1"/>
+      <w:numFmt w:val="bullet"/>
+      <w:lvlText w:val=""/>
+      <w:lvlJc w:val="left"/>
+      <w:pPr>
+        <w:ind w:left="5400" w:hanging="360"/>
+      </w:pPr>
+      <w:rPr>
+        <w:rFonts w:hint="default" w:ascii="Wingdings" w:hAnsi="Wingdings"/>
+      </w:rPr>
+    </w:lvl>
+    <w:lvl xmlns:w="http://schemas.openxmlformats.org/wordprocessingml/2006/main" w:ilvl="8">
+      <w:start w:val="1"/>
+      <w:numFmt w:val="bullet"/>
+      <w:lvlText w:val=""/>
+      <w:lvlJc w:val="left"/>
+      <w:pPr>
+        <w:ind w:left="6120" w:hanging="360"/>
+      </w:pPr>
+      <w:rPr>
+        <w:rFonts w:hint="default" w:ascii="Wingdings" w:hAnsi="Wingdings"/>
+      </w:rPr>
+    </w:lvl>
+  </w:abstractNum>
+  <w:abstractNum xmlns:w="http://schemas.openxmlformats.org/wordprocessingml/2006/main" w:abstractNumId="19">
+    <w:nsid w:val="1d2d71a1"/>
+    <w:multiLevelType xmlns:w="http://schemas.openxmlformats.org/wordprocessingml/2006/main" w:val="hybridMultilevel"/>
+    <w:lvl xmlns:w="http://schemas.openxmlformats.org/wordprocessingml/2006/main" w:ilvl="0">
+      <w:start w:val="1"/>
+      <w:numFmt w:val="bullet"/>
+      <w:lvlText w:val=""/>
+      <w:lvlJc w:val="left"/>
+      <w:pPr>
+        <w:ind w:left="720" w:hanging="360"/>
+      </w:pPr>
+      <w:rPr>
+        <w:rFonts w:hint="default" w:ascii="Symbol" w:hAnsi="Symbol"/>
+      </w:rPr>
+    </w:lvl>
+    <w:lvl xmlns:w="http://schemas.openxmlformats.org/wordprocessingml/2006/main" w:ilvl="1">
+      <w:start w:val="1"/>
+      <w:numFmt w:val="bullet"/>
+      <w:lvlText w:val="o"/>
+      <w:lvlJc w:val="left"/>
+      <w:pPr>
+        <w:ind w:left="1440" w:hanging="360"/>
+      </w:pPr>
+      <w:rPr>
+        <w:rFonts w:hint="default" w:ascii="Courier New" w:hAnsi="Courier New"/>
+      </w:rPr>
+    </w:lvl>
+    <w:lvl xmlns:w="http://schemas.openxmlformats.org/wordprocessingml/2006/main" w:ilvl="2">
+      <w:start w:val="1"/>
+      <w:numFmt w:val="bullet"/>
+      <w:lvlText w:val=""/>
+      <w:lvlJc w:val="left"/>
+      <w:pPr>
+        <w:ind w:left="2160" w:hanging="360"/>
+      </w:pPr>
+      <w:rPr>
+        <w:rFonts w:hint="default" w:ascii="Wingdings" w:hAnsi="Wingdings"/>
+      </w:rPr>
+    </w:lvl>
+    <w:lvl xmlns:w="http://schemas.openxmlformats.org/wordprocessingml/2006/main" w:ilvl="3">
+      <w:start w:val="1"/>
+      <w:numFmt w:val="bullet"/>
+      <w:lvlText w:val=""/>
+      <w:lvlJc w:val="left"/>
+      <w:pPr>
+        <w:ind w:left="2880" w:hanging="360"/>
+      </w:pPr>
+      <w:rPr>
+        <w:rFonts w:hint="default" w:ascii="Symbol" w:hAnsi="Symbol"/>
+      </w:rPr>
+    </w:lvl>
+    <w:lvl xmlns:w="http://schemas.openxmlformats.org/wordprocessingml/2006/main" w:ilvl="4">
+      <w:start w:val="1"/>
+      <w:numFmt w:val="bullet"/>
+      <w:lvlText w:val="o"/>
+      <w:lvlJc w:val="left"/>
+      <w:pPr>
+        <w:ind w:left="3600" w:hanging="360"/>
+      </w:pPr>
+      <w:rPr>
+        <w:rFonts w:hint="default" w:ascii="Courier New" w:hAnsi="Courier New"/>
+      </w:rPr>
+    </w:lvl>
+    <w:lvl xmlns:w="http://schemas.openxmlformats.org/wordprocessingml/2006/main" w:ilvl="5">
+      <w:start w:val="1"/>
+      <w:numFmt w:val="bullet"/>
+      <w:lvlText w:val=""/>
+      <w:lvlJc w:val="left"/>
+      <w:pPr>
+        <w:ind w:left="4320" w:hanging="360"/>
+      </w:pPr>
+      <w:rPr>
+        <w:rFonts w:hint="default" w:ascii="Wingdings" w:hAnsi="Wingdings"/>
+      </w:rPr>
+    </w:lvl>
+    <w:lvl xmlns:w="http://schemas.openxmlformats.org/wordprocessingml/2006/main" w:ilvl="6">
+      <w:start w:val="1"/>
+      <w:numFmt w:val="bullet"/>
+      <w:lvlText w:val=""/>
+      <w:lvlJc w:val="left"/>
+      <w:pPr>
+        <w:ind w:left="5040" w:hanging="360"/>
+      </w:pPr>
+      <w:rPr>
+        <w:rFonts w:hint="default" w:ascii="Symbol" w:hAnsi="Symbol"/>
+      </w:rPr>
+    </w:lvl>
+    <w:lvl xmlns:w="http://schemas.openxmlformats.org/wordprocessingml/2006/main" w:ilvl="7">
+      <w:start w:val="1"/>
+      <w:numFmt w:val="bullet"/>
+      <w:lvlText w:val="o"/>
+      <w:lvlJc w:val="left"/>
+      <w:pPr>
+        <w:ind w:left="5760" w:hanging="360"/>
+      </w:pPr>
+      <w:rPr>
+        <w:rFonts w:hint="default" w:ascii="Courier New" w:hAnsi="Courier New"/>
+      </w:rPr>
+    </w:lvl>
+    <w:lvl xmlns:w="http://schemas.openxmlformats.org/wordprocessingml/2006/main" w:ilvl="8">
+      <w:start w:val="1"/>
+      <w:numFmt w:val="bullet"/>
+      <w:lvlText w:val=""/>
+      <w:lvlJc w:val="left"/>
+      <w:pPr>
+        <w:ind w:left="6480" w:hanging="360"/>
+      </w:pPr>
+      <w:rPr>
+        <w:rFonts w:hint="default" w:ascii="Wingdings" w:hAnsi="Wingdings"/>
+      </w:rPr>
+    </w:lvl>
+  </w:abstractNum>
+  <w:abstractNum xmlns:w="http://schemas.openxmlformats.org/wordprocessingml/2006/main" w:abstractNumId="18">
+    <w:nsid w:val="26557a2"/>
+    <w:multiLevelType xmlns:w="http://schemas.openxmlformats.org/wordprocessingml/2006/main" w:val="hybridMultilevel"/>
+    <w:lvl xmlns:w="http://schemas.openxmlformats.org/wordprocessingml/2006/main" w:ilvl="0">
+      <w:start w:val="1"/>
+      <w:numFmt w:val="bullet"/>
+      <w:lvlText w:val=""/>
+      <w:lvlJc w:val="left"/>
+      <w:pPr>
+        <w:ind w:left="720" w:hanging="360"/>
+      </w:pPr>
+      <w:rPr>
+        <w:rFonts w:hint="default" w:ascii="Symbol" w:hAnsi="Symbol"/>
+      </w:rPr>
+    </w:lvl>
+    <w:lvl xmlns:w="http://schemas.openxmlformats.org/wordprocessingml/2006/main" w:ilvl="1">
+      <w:start w:val="1"/>
+      <w:numFmt w:val="bullet"/>
+      <w:lvlText w:val="o"/>
+      <w:lvlJc w:val="left"/>
+      <w:pPr>
+        <w:ind w:left="1440" w:hanging="360"/>
+      </w:pPr>
+      <w:rPr>
+        <w:rFonts w:hint="default" w:ascii="Courier New" w:hAnsi="Courier New"/>
+      </w:rPr>
+    </w:lvl>
+    <w:lvl xmlns:w="http://schemas.openxmlformats.org/wordprocessingml/2006/main" w:ilvl="2">
+      <w:start w:val="1"/>
+      <w:numFmt w:val="bullet"/>
+      <w:lvlText w:val=""/>
+      <w:lvlJc w:val="left"/>
+      <w:pPr>
+        <w:ind w:left="2160" w:hanging="360"/>
+      </w:pPr>
+      <w:rPr>
+        <w:rFonts w:hint="default" w:ascii="Wingdings" w:hAnsi="Wingdings"/>
+      </w:rPr>
+    </w:lvl>
+    <w:lvl xmlns:w="http://schemas.openxmlformats.org/wordprocessingml/2006/main" w:ilvl="3">
+      <w:start w:val="1"/>
+      <w:numFmt w:val="bullet"/>
+      <w:lvlText w:val=""/>
+      <w:lvlJc w:val="left"/>
+      <w:pPr>
+        <w:ind w:left="2880" w:hanging="360"/>
+      </w:pPr>
+      <w:rPr>
+        <w:rFonts w:hint="default" w:ascii="Symbol" w:hAnsi="Symbol"/>
+      </w:rPr>
+    </w:lvl>
+    <w:lvl xmlns:w="http://schemas.openxmlformats.org/wordprocessingml/2006/main" w:ilvl="4">
+      <w:start w:val="1"/>
+      <w:numFmt w:val="bullet"/>
+      <w:lvlText w:val="o"/>
+      <w:lvlJc w:val="left"/>
+      <w:pPr>
+        <w:ind w:left="3600" w:hanging="360"/>
+      </w:pPr>
+      <w:rPr>
+        <w:rFonts w:hint="default" w:ascii="Courier New" w:hAnsi="Courier New"/>
+      </w:rPr>
+    </w:lvl>
+    <w:lvl xmlns:w="http://schemas.openxmlformats.org/wordprocessingml/2006/main" w:ilvl="5">
+      <w:start w:val="1"/>
+      <w:numFmt w:val="bullet"/>
+      <w:lvlText w:val=""/>
+      <w:lvlJc w:val="left"/>
+      <w:pPr>
+        <w:ind w:left="4320" w:hanging="360"/>
+      </w:pPr>
+      <w:rPr>
+        <w:rFonts w:hint="default" w:ascii="Wingdings" w:hAnsi="Wingdings"/>
+      </w:rPr>
+    </w:lvl>
+    <w:lvl xmlns:w="http://schemas.openxmlformats.org/wordprocessingml/2006/main" w:ilvl="6">
+      <w:start w:val="1"/>
+      <w:numFmt w:val="bullet"/>
+      <w:lvlText w:val=""/>
+      <w:lvlJc w:val="left"/>
+      <w:pPr>
+        <w:ind w:left="5040" w:hanging="360"/>
+      </w:pPr>
+      <w:rPr>
+        <w:rFonts w:hint="default" w:ascii="Symbol" w:hAnsi="Symbol"/>
+      </w:rPr>
+    </w:lvl>
+    <w:lvl xmlns:w="http://schemas.openxmlformats.org/wordprocessingml/2006/main" w:ilvl="7">
+      <w:start w:val="1"/>
+      <w:numFmt w:val="bullet"/>
+      <w:lvlText w:val="o"/>
+      <w:lvlJc w:val="left"/>
+      <w:pPr>
+        <w:ind w:left="5760" w:hanging="360"/>
+      </w:pPr>
+      <w:rPr>
+        <w:rFonts w:hint="default" w:ascii="Courier New" w:hAnsi="Courier New"/>
+      </w:rPr>
+    </w:lvl>
+    <w:lvl xmlns:w="http://schemas.openxmlformats.org/wordprocessingml/2006/main" w:ilvl="8">
+      <w:start w:val="1"/>
+      <w:numFmt w:val="bullet"/>
+      <w:lvlText w:val=""/>
+      <w:lvlJc w:val="left"/>
+      <w:pPr>
+        <w:ind w:left="6480" w:hanging="360"/>
+      </w:pPr>
+      <w:rPr>
+        <w:rFonts w:hint="default" w:ascii="Wingdings" w:hAnsi="Wingdings"/>
+      </w:rPr>
+    </w:lvl>
+  </w:abstractNum>
+  <w:abstractNum xmlns:w="http://schemas.openxmlformats.org/wordprocessingml/2006/main" w:abstractNumId="17">
+    <w:nsid w:val="1c11cbbf"/>
+    <w:multiLevelType xmlns:w="http://schemas.openxmlformats.org/wordprocessingml/2006/main" w:val="hybridMultilevel"/>
+    <w:lvl xmlns:w="http://schemas.openxmlformats.org/wordprocessingml/2006/main" w:ilvl="0">
+      <w:start w:val="1"/>
+      <w:numFmt w:val="decimal"/>
+      <w:lvlText w:val="%1."/>
+      <w:lvlJc w:val="left"/>
+      <w:pPr>
+        <w:ind w:left="720" w:hanging="360"/>
+      </w:pPr>
+    </w:lvl>
+    <w:lvl xmlns:w="http://schemas.openxmlformats.org/wordprocessingml/2006/main" w:ilvl="1">
+      <w:start w:val="1"/>
+      <w:numFmt w:val="lowerLetter"/>
+      <w:lvlText w:val="%2."/>
+      <w:lvlJc w:val="left"/>
+      <w:pPr>
+        <w:ind w:left="1440" w:hanging="360"/>
+      </w:pPr>
+    </w:lvl>
+    <w:lvl xmlns:w="http://schemas.openxmlformats.org/wordprocessingml/2006/main" w:ilvl="2">
+      <w:start w:val="1"/>
+      <w:numFmt w:val="lowerRoman"/>
+      <w:lvlText w:val="%3."/>
+      <w:lvlJc w:val="right"/>
+      <w:pPr>
+        <w:ind w:left="2160" w:hanging="180"/>
+      </w:pPr>
+    </w:lvl>
+    <w:lvl xmlns:w="http://schemas.openxmlformats.org/wordprocessingml/2006/main" w:ilvl="3">
+      <w:start w:val="1"/>
+      <w:numFmt w:val="decimal"/>
+      <w:lvlText w:val="%4."/>
+      <w:lvlJc w:val="left"/>
+      <w:pPr>
+        <w:ind w:left="2880" w:hanging="360"/>
+      </w:pPr>
+    </w:lvl>
+    <w:lvl xmlns:w="http://schemas.openxmlformats.org/wordprocessingml/2006/main" w:ilvl="4">
+      <w:start w:val="1"/>
+      <w:numFmt w:val="lowerLetter"/>
+      <w:lvlText w:val="%5."/>
+      <w:lvlJc w:val="left"/>
+      <w:pPr>
+        <w:ind w:left="3600" w:hanging="360"/>
+      </w:pPr>
+    </w:lvl>
+    <w:lvl xmlns:w="http://schemas.openxmlformats.org/wordprocessingml/2006/main" w:ilvl="5">
+      <w:start w:val="1"/>
+      <w:numFmt w:val="lowerRoman"/>
+      <w:lvlText w:val="%6."/>
+      <w:lvlJc w:val="right"/>
+      <w:pPr>
+        <w:ind w:left="4320" w:hanging="180"/>
+      </w:pPr>
+    </w:lvl>
+    <w:lvl xmlns:w="http://schemas.openxmlformats.org/wordprocessingml/2006/main" w:ilvl="6">
+      <w:start w:val="1"/>
+      <w:numFmt w:val="decimal"/>
+      <w:lvlText w:val="%7."/>
+      <w:lvlJc w:val="left"/>
+      <w:pPr>
+        <w:ind w:left="5040" w:hanging="360"/>
+      </w:pPr>
+    </w:lvl>
+    <w:lvl xmlns:w="http://schemas.openxmlformats.org/wordprocessingml/2006/main" w:ilvl="7">
+      <w:start w:val="1"/>
+      <w:numFmt w:val="lowerLetter"/>
+      <w:lvlText w:val="%8."/>
+      <w:lvlJc w:val="left"/>
+      <w:pPr>
+        <w:ind w:left="5760" w:hanging="360"/>
+      </w:pPr>
+    </w:lvl>
+    <w:lvl xmlns:w="http://schemas.openxmlformats.org/wordprocessingml/2006/main" w:ilvl="8">
+      <w:start w:val="1"/>
+      <w:numFmt w:val="lowerRoman"/>
+      <w:lvlText w:val="%9."/>
+      <w:lvlJc w:val="right"/>
+      <w:pPr>
+        <w:ind w:left="6480" w:hanging="180"/>
+      </w:pPr>
+    </w:lvl>
+  </w:abstractNum>
   <w:abstractNum xmlns:w="http://schemas.openxmlformats.org/wordprocessingml/2006/main" w:abstractNumId="16">
     <w:nsid w:val="63203c01"/>
     <w:multiLevelType xmlns:w="http://schemas.openxmlformats.org/wordprocessingml/2006/main" w:val="hybridMultilevel"/>
@@ -8932,6 +11050,69 @@
       </w:rPr>
     </w:lvl>
   </w:abstractNum>
+  <w:num w:numId="37">
+    <w:abstractNumId w:val="37"/>
+  </w:num>
+  <w:num w:numId="36">
+    <w:abstractNumId w:val="36"/>
+  </w:num>
+  <w:num w:numId="35">
+    <w:abstractNumId w:val="35"/>
+  </w:num>
+  <w:num w:numId="34">
+    <w:abstractNumId w:val="34"/>
+  </w:num>
+  <w:num w:numId="33">
+    <w:abstractNumId w:val="33"/>
+  </w:num>
+  <w:num w:numId="32">
+    <w:abstractNumId w:val="32"/>
+  </w:num>
+  <w:num w:numId="31">
+    <w:abstractNumId w:val="31"/>
+  </w:num>
+  <w:num w:numId="30">
+    <w:abstractNumId w:val="30"/>
+  </w:num>
+  <w:num w:numId="29">
+    <w:abstractNumId w:val="29"/>
+  </w:num>
+  <w:num w:numId="28">
+    <w:abstractNumId w:val="28"/>
+  </w:num>
+  <w:num w:numId="27">
+    <w:abstractNumId w:val="27"/>
+  </w:num>
+  <w:num w:numId="26">
+    <w:abstractNumId w:val="26"/>
+  </w:num>
+  <w:num w:numId="25">
+    <w:abstractNumId w:val="25"/>
+  </w:num>
+  <w:num w:numId="24">
+    <w:abstractNumId w:val="24"/>
+  </w:num>
+  <w:num w:numId="23">
+    <w:abstractNumId w:val="23"/>
+  </w:num>
+  <w:num w:numId="22">
+    <w:abstractNumId w:val="22"/>
+  </w:num>
+  <w:num w:numId="21">
+    <w:abstractNumId w:val="21"/>
+  </w:num>
+  <w:num w:numId="20">
+    <w:abstractNumId w:val="20"/>
+  </w:num>
+  <w:num w:numId="19">
+    <w:abstractNumId w:val="19"/>
+  </w:num>
+  <w:num w:numId="18">
+    <w:abstractNumId w:val="18"/>
+  </w:num>
+  <w:num w:numId="17">
+    <w:abstractNumId w:val="17"/>
+  </w:num>
   <w:num w:numId="16">
     <w:abstractNumId w:val="16"/>
   </w:num>

</xml_diff>